<commit_message>
DevOps in Detail: A Comprehensive Guide   3/3/2025
</commit_message>
<xml_diff>
--- a/Notes/Devops.docx
+++ b/Notes/Devops.docx
@@ -434,25 +434,7 @@
           <w:sz w:val="24"/>
           <w:szCs w:val="24"/>
         </w:rPr>
-        <w:t>Infrastructure as Code (</w:t>
-      </w:r>
-      <w:proofErr w:type="spellStart"/>
-      <w:r>
-        <w:rPr>
-          <w:rFonts w:ascii="Times New Roman" w:hAnsi="Times New Roman" w:cs="Times New Roman"/>
-          <w:sz w:val="24"/>
-          <w:szCs w:val="24"/>
-        </w:rPr>
-        <w:t>IaC</w:t>
-      </w:r>
-      <w:proofErr w:type="spellEnd"/>
-      <w:r>
-        <w:rPr>
-          <w:rFonts w:ascii="Times New Roman" w:hAnsi="Times New Roman" w:cs="Times New Roman"/>
-          <w:sz w:val="24"/>
-          <w:szCs w:val="24"/>
-        </w:rPr>
-        <w:t>) – Define and provision infrastructure automatically.</w:t>
+        <w:t>Infrastructure as Code (IaC) – Define and provision infrastructure automatically.</w:t>
       </w:r>
     </w:p>
     <w:p>
@@ -701,36 +683,8 @@
           <w:sz w:val="24"/>
           <w:szCs w:val="24"/>
         </w:rPr>
-        <w:t xml:space="preserve"> Tools: </w:t>
-      </w:r>
-      <w:proofErr w:type="spellStart"/>
-      <w:r>
-        <w:rPr>
-          <w:rFonts w:ascii="Times New Roman" w:hAnsi="Times New Roman" w:cs="Times New Roman"/>
-          <w:sz w:val="24"/>
-          <w:szCs w:val="24"/>
-        </w:rPr>
-        <w:t>ArgoCD</w:t>
-      </w:r>
-      <w:proofErr w:type="spellEnd"/>
-      <w:r>
-        <w:rPr>
-          <w:rFonts w:ascii="Times New Roman" w:hAnsi="Times New Roman" w:cs="Times New Roman"/>
-          <w:sz w:val="24"/>
-          <w:szCs w:val="24"/>
-        </w:rPr>
-        <w:t xml:space="preserve">, Spinnaker, </w:t>
-      </w:r>
-      <w:proofErr w:type="spellStart"/>
-      <w:r>
-        <w:rPr>
-          <w:rFonts w:ascii="Times New Roman" w:hAnsi="Times New Roman" w:cs="Times New Roman"/>
-          <w:sz w:val="24"/>
-          <w:szCs w:val="24"/>
-        </w:rPr>
-        <w:t>FluxCD</w:t>
-      </w:r>
-      <w:proofErr w:type="spellEnd"/>
+        <w:t xml:space="preserve"> Tools: ArgoCD, Spinnaker, FluxCD</w:t>
+      </w:r>
     </w:p>
     <w:p>
       <w:pPr>
@@ -1029,18 +983,8 @@
           <w:sz w:val="24"/>
           <w:szCs w:val="24"/>
         </w:rPr>
-        <w:t xml:space="preserve"> Logging Tools: ELK Stack (Elasticsearch, Logstash, Kibana), </w:t>
-      </w:r>
-      <w:proofErr w:type="spellStart"/>
-      <w:r>
-        <w:rPr>
-          <w:rFonts w:ascii="Times New Roman" w:hAnsi="Times New Roman" w:cs="Times New Roman"/>
-          <w:sz w:val="24"/>
-          <w:szCs w:val="24"/>
-        </w:rPr>
-        <w:t>Graylog</w:t>
-      </w:r>
-      <w:proofErr w:type="spellEnd"/>
+        <w:t xml:space="preserve"> Logging Tools: ELK Stack (Elasticsearch, Logstash, Kibana), Graylog</w:t>
+      </w:r>
     </w:p>
     <w:p>
       <w:pPr>
@@ -1514,23 +1458,7 @@
           <w:sz w:val="24"/>
           <w:szCs w:val="24"/>
         </w:rPr>
-        <w:t xml:space="preserve">Step 4: Release &amp; </w:t>
-      </w:r>
-      <w:r>
-        <w:rPr>
-          <w:rFonts w:ascii="Times New Roman" w:hAnsi="Times New Roman" w:cs="Times New Roman"/>
-          <w:sz w:val="24"/>
-          <w:szCs w:val="24"/>
-        </w:rPr>
-        <w:t>deploy</w:t>
-      </w:r>
-      <w:r>
-        <w:rPr>
-          <w:rFonts w:ascii="Times New Roman" w:hAnsi="Times New Roman" w:cs="Times New Roman"/>
-          <w:sz w:val="24"/>
-          <w:szCs w:val="24"/>
-        </w:rPr>
-        <w:t xml:space="preserve"> </w:t>
+        <w:t xml:space="preserve">Step 4: Release &amp; deploy </w:t>
       </w:r>
       <w:r>
         <w:rPr>
@@ -1582,25 +1510,7 @@
           <w:sz w:val="24"/>
           <w:szCs w:val="24"/>
         </w:rPr>
-        <w:t xml:space="preserve">Uses Kubernetes, Docker, </w:t>
-      </w:r>
-      <w:proofErr w:type="spellStart"/>
-      <w:r>
-        <w:rPr>
-          <w:rFonts w:ascii="Times New Roman" w:hAnsi="Times New Roman" w:cs="Times New Roman"/>
-          <w:sz w:val="24"/>
-          <w:szCs w:val="24"/>
-        </w:rPr>
-        <w:t>ArgoCD</w:t>
-      </w:r>
-      <w:proofErr w:type="spellEnd"/>
-      <w:r>
-        <w:rPr>
-          <w:rFonts w:ascii="Times New Roman" w:hAnsi="Times New Roman" w:cs="Times New Roman"/>
-          <w:sz w:val="24"/>
-          <w:szCs w:val="24"/>
-        </w:rPr>
-        <w:t xml:space="preserve"> for containerized deployment.</w:t>
+        <w:t>Uses Kubernetes, Docker, ArgoCD for containerized deployment.</w:t>
       </w:r>
     </w:p>
     <w:p>
@@ -2101,29 +2011,7 @@
                 <w:sz w:val="24"/>
                 <w:szCs w:val="24"/>
               </w:rPr>
-              <w:t>Infrastructure as Code (</w:t>
-            </w:r>
-            <w:proofErr w:type="spellStart"/>
-            <w:r>
-              <w:rPr>
-                <w:rFonts w:ascii="Times New Roman" w:hAnsi="Times New Roman" w:cs="Times New Roman"/>
-                <w:b/>
-                <w:bCs/>
-                <w:sz w:val="24"/>
-                <w:szCs w:val="24"/>
-              </w:rPr>
-              <w:t>IaC</w:t>
-            </w:r>
-            <w:proofErr w:type="spellEnd"/>
-            <w:r>
-              <w:rPr>
-                <w:rFonts w:ascii="Times New Roman" w:hAnsi="Times New Roman" w:cs="Times New Roman"/>
-                <w:b/>
-                <w:bCs/>
-                <w:sz w:val="24"/>
-                <w:szCs w:val="24"/>
-              </w:rPr>
-              <w:t>)</w:t>
+              <w:t>Infrastructure as Code (IaC)</w:t>
             </w:r>
           </w:p>
         </w:tc>
@@ -2339,23 +2227,13 @@
                 <w:szCs w:val="24"/>
               </w:rPr>
             </w:pPr>
-            <w:proofErr w:type="spellStart"/>
             <w:r>
               <w:rPr>
                 <w:rFonts w:ascii="Times New Roman" w:hAnsi="Times New Roman" w:cs="Times New Roman"/>
                 <w:sz w:val="24"/>
                 <w:szCs w:val="24"/>
               </w:rPr>
-              <w:t>Analyze</w:t>
-            </w:r>
-            <w:proofErr w:type="spellEnd"/>
-            <w:r>
-              <w:rPr>
-                <w:rFonts w:ascii="Times New Roman" w:hAnsi="Times New Roman" w:cs="Times New Roman"/>
-                <w:sz w:val="24"/>
-                <w:szCs w:val="24"/>
-              </w:rPr>
-              <w:t xml:space="preserve"> logs for errors</w:t>
+              <w:t>Analyze logs for errors</w:t>
             </w:r>
           </w:p>
         </w:tc>
@@ -2495,25 +2373,7 @@
           <w:sz w:val="24"/>
           <w:szCs w:val="24"/>
         </w:rPr>
-        <w:t>A. Infrastructure as Code (</w:t>
-      </w:r>
-      <w:proofErr w:type="spellStart"/>
-      <w:r>
-        <w:rPr>
-          <w:rFonts w:ascii="Times New Roman" w:hAnsi="Times New Roman" w:cs="Times New Roman"/>
-          <w:sz w:val="24"/>
-          <w:szCs w:val="24"/>
-        </w:rPr>
-        <w:t>IaC</w:t>
-      </w:r>
-      <w:proofErr w:type="spellEnd"/>
-      <w:r>
-        <w:rPr>
-          <w:rFonts w:ascii="Times New Roman" w:hAnsi="Times New Roman" w:cs="Times New Roman"/>
-          <w:sz w:val="24"/>
-          <w:szCs w:val="24"/>
-        </w:rPr>
-        <w:t>)</w:t>
+        <w:t>A. Infrastructure as Code (IaC)</w:t>
       </w:r>
     </w:p>
     <w:p>
@@ -2724,25 +2584,7 @@
           <w:sz w:val="24"/>
           <w:szCs w:val="24"/>
         </w:rPr>
-        <w:t xml:space="preserve">D. </w:t>
-      </w:r>
-      <w:proofErr w:type="spellStart"/>
-      <w:r>
-        <w:rPr>
-          <w:rFonts w:ascii="Times New Roman" w:hAnsi="Times New Roman" w:cs="Times New Roman"/>
-          <w:sz w:val="24"/>
-          <w:szCs w:val="24"/>
-        </w:rPr>
-        <w:t>DevSecOps</w:t>
-      </w:r>
-      <w:proofErr w:type="spellEnd"/>
-      <w:r>
-        <w:rPr>
-          <w:rFonts w:ascii="Times New Roman" w:hAnsi="Times New Roman" w:cs="Times New Roman"/>
-          <w:sz w:val="24"/>
-          <w:szCs w:val="24"/>
-        </w:rPr>
-        <w:t xml:space="preserve"> (Security in DevOps)</w:t>
+        <w:t>D. DevSecOps (Security in DevOps)</w:t>
       </w:r>
     </w:p>
     <w:p>
@@ -2786,25 +2628,7 @@
           <w:sz w:val="24"/>
           <w:szCs w:val="24"/>
         </w:rPr>
-        <w:t xml:space="preserve">Uses SonarQube, OWASP ZAP, </w:t>
-      </w:r>
-      <w:proofErr w:type="spellStart"/>
-      <w:r>
-        <w:rPr>
-          <w:rFonts w:ascii="Times New Roman" w:hAnsi="Times New Roman" w:cs="Times New Roman"/>
-          <w:sz w:val="24"/>
-          <w:szCs w:val="24"/>
-        </w:rPr>
-        <w:t>HashiCorp</w:t>
-      </w:r>
-      <w:proofErr w:type="spellEnd"/>
-      <w:r>
-        <w:rPr>
-          <w:rFonts w:ascii="Times New Roman" w:hAnsi="Times New Roman" w:cs="Times New Roman"/>
-          <w:sz w:val="24"/>
-          <w:szCs w:val="24"/>
-        </w:rPr>
-        <w:t xml:space="preserve"> Vault.</w:t>
+        <w:t>Uses SonarQube, OWASP ZAP, HashiCorp Vault.</w:t>
       </w:r>
     </w:p>
     <w:p>
@@ -3678,18 +3502,8 @@
           <w:sz w:val="24"/>
           <w:szCs w:val="24"/>
         </w:rPr>
-        <w:t xml:space="preserve"> Tools: Jenkins, GitHub Actions, GitLab CI/CD, </w:t>
-      </w:r>
-      <w:proofErr w:type="spellStart"/>
-      <w:r>
-        <w:rPr>
-          <w:rFonts w:ascii="Times New Roman" w:hAnsi="Times New Roman" w:cs="Times New Roman"/>
-          <w:sz w:val="24"/>
-          <w:szCs w:val="24"/>
-        </w:rPr>
-        <w:t>ArgoCD</w:t>
-      </w:r>
-      <w:proofErr w:type="spellEnd"/>
+        <w:t xml:space="preserve"> Tools: Jenkins, GitHub Actions, GitLab CI/CD, ArgoCD</w:t>
+      </w:r>
     </w:p>
     <w:p>
       <w:pPr>
@@ -3860,43 +3674,7 @@
           <w:sz w:val="24"/>
           <w:szCs w:val="24"/>
         </w:rPr>
-        <w:t>Infrastructure as Code (</w:t>
-      </w:r>
-      <w:proofErr w:type="spellStart"/>
-      <w:r>
-        <w:rPr>
-          <w:rFonts w:ascii="Times New Roman" w:hAnsi="Times New Roman" w:cs="Times New Roman"/>
-          <w:sz w:val="24"/>
-          <w:szCs w:val="24"/>
-        </w:rPr>
-        <w:t>IaC</w:t>
-      </w:r>
-      <w:proofErr w:type="spellEnd"/>
-      <w:r>
-        <w:rPr>
-          <w:rFonts w:ascii="Times New Roman" w:hAnsi="Times New Roman" w:cs="Times New Roman"/>
-          <w:sz w:val="24"/>
-          <w:szCs w:val="24"/>
-        </w:rPr>
-        <w:t xml:space="preserve">) lets </w:t>
-      </w:r>
-      <w:proofErr w:type="spellStart"/>
-      <w:r>
-        <w:rPr>
-          <w:rFonts w:ascii="Times New Roman" w:hAnsi="Times New Roman" w:cs="Times New Roman"/>
-          <w:sz w:val="24"/>
-          <w:szCs w:val="24"/>
-        </w:rPr>
-        <w:t>devs</w:t>
-      </w:r>
-      <w:proofErr w:type="spellEnd"/>
-      <w:r>
-        <w:rPr>
-          <w:rFonts w:ascii="Times New Roman" w:hAnsi="Times New Roman" w:cs="Times New Roman"/>
-          <w:sz w:val="24"/>
-          <w:szCs w:val="24"/>
-        </w:rPr>
-        <w:t xml:space="preserve"> and ops work together on cloud deployments.</w:t>
+        <w:t>Infrastructure as Code (IaC) lets devs and ops work together on cloud deployments.</w:t>
       </w:r>
     </w:p>
     <w:p>
@@ -4337,29 +4115,7 @@
           <w:sz w:val="24"/>
           <w:szCs w:val="24"/>
         </w:rPr>
-        <w:t>5. Ensure Security (</w:t>
-      </w:r>
-      <w:proofErr w:type="spellStart"/>
-      <w:r>
-        <w:rPr>
-          <w:rFonts w:ascii="Times New Roman" w:hAnsi="Times New Roman" w:cs="Times New Roman"/>
-          <w:b/>
-          <w:bCs/>
-          <w:sz w:val="24"/>
-          <w:szCs w:val="24"/>
-        </w:rPr>
-        <w:t>DevSecOps</w:t>
-      </w:r>
-      <w:proofErr w:type="spellEnd"/>
-      <w:r>
-        <w:rPr>
-          <w:rFonts w:ascii="Times New Roman" w:hAnsi="Times New Roman" w:cs="Times New Roman"/>
-          <w:b/>
-          <w:bCs/>
-          <w:sz w:val="24"/>
-          <w:szCs w:val="24"/>
-        </w:rPr>
-        <w:t xml:space="preserve">) </w:t>
+        <w:t xml:space="preserve">5. Ensure Security (DevSecOps) </w:t>
       </w:r>
       <w:r>
         <w:rPr>
@@ -4509,15 +4265,7 @@
           <w:sz w:val="24"/>
           <w:szCs w:val="24"/>
         </w:rPr>
-        <w:t>Hashi Corp</w:t>
-      </w:r>
-      <w:r>
-        <w:rPr>
-          <w:rFonts w:ascii="Times New Roman" w:hAnsi="Times New Roman" w:cs="Times New Roman"/>
-          <w:sz w:val="24"/>
-          <w:szCs w:val="24"/>
-        </w:rPr>
-        <w:t xml:space="preserve"> Vault securely stores API keys and credentials.</w:t>
+        <w:t>Hashi Corp Vault securely stores API keys and credentials.</w:t>
       </w:r>
     </w:p>
     <w:p>
@@ -5048,25 +4796,7 @@
                 <w:sz w:val="24"/>
                 <w:szCs w:val="24"/>
               </w:rPr>
-              <w:t>Security at every stage (</w:t>
-            </w:r>
-            <w:proofErr w:type="spellStart"/>
-            <w:r>
-              <w:rPr>
-                <w:rFonts w:ascii="Times New Roman" w:hAnsi="Times New Roman" w:cs="Times New Roman"/>
-                <w:sz w:val="24"/>
-                <w:szCs w:val="24"/>
-              </w:rPr>
-              <w:t>DevSecOps</w:t>
-            </w:r>
-            <w:proofErr w:type="spellEnd"/>
-            <w:r>
-              <w:rPr>
-                <w:rFonts w:ascii="Times New Roman" w:hAnsi="Times New Roman" w:cs="Times New Roman"/>
-                <w:sz w:val="24"/>
-                <w:szCs w:val="24"/>
-              </w:rPr>
-              <w:t>)</w:t>
+              <w:t>Security at every stage (DevSecOps)</w:t>
             </w:r>
           </w:p>
         </w:tc>
@@ -5207,14 +4937,36 @@
       <w:pPr>
         <w:shd w:val="clear" w:color="auto" w:fill="D5DCE4" w:themeFill="text2" w:themeFillTint="33"/>
         <w:rPr>
+          <w:rFonts w:ascii="Times New Roman" w:hAnsi="Times New Roman" w:cs="Times New Roman"/>
+          <w:b/>
+          <w:bCs/>
+          <w:sz w:val="24"/>
+          <w:szCs w:val="24"/>
+        </w:rPr>
+      </w:pPr>
+      <w:r>
+        <w:rPr>
+          <w:rFonts w:ascii="Times New Roman" w:hAnsi="Times New Roman" w:cs="Times New Roman"/>
+          <w:b/>
+          <w:bCs/>
+          <w:sz w:val="24"/>
+          <w:szCs w:val="24"/>
+        </w:rPr>
+        <w:t xml:space="preserve">A. Waterfall Model (Pre-2000s) </w:t>
+      </w:r>
+      <w:r>
+        <w:rPr>
           <w:rFonts w:ascii="Segoe UI Emoji" w:hAnsi="Segoe UI Emoji" w:cs="Segoe UI Emoji"/>
           <w:b/>
           <w:bCs/>
           <w:sz w:val="24"/>
           <w:szCs w:val="24"/>
         </w:rPr>
-      </w:pPr>
-      <w:r>
+        <w:t>📏</w:t>
+      </w:r>
+    </w:p>
+    <w:p>
+      <w:pPr>
         <w:rPr>
           <w:rFonts w:ascii="Times New Roman" w:hAnsi="Times New Roman" w:cs="Times New Roman"/>
           <w:b/>
@@ -5222,8 +4974,7 @@
           <w:sz w:val="24"/>
           <w:szCs w:val="24"/>
         </w:rPr>
-        <w:t xml:space="preserve">A. Waterfall Model (Pre-2000s) </w:t>
-      </w:r>
+      </w:pPr>
       <w:r>
         <w:rPr>
           <w:rFonts w:ascii="Segoe UI Emoji" w:hAnsi="Segoe UI Emoji" w:cs="Segoe UI Emoji"/>
@@ -5232,11 +4983,9 @@
           <w:sz w:val="24"/>
           <w:szCs w:val="24"/>
         </w:rPr>
-        <w:t>📏</w:t>
-      </w:r>
-    </w:p>
-    <w:p>
-      <w:pPr>
+        <w:t>✅</w:t>
+      </w:r>
+      <w:r>
         <w:rPr>
           <w:rFonts w:ascii="Times New Roman" w:hAnsi="Times New Roman" w:cs="Times New Roman"/>
           <w:b/>
@@ -5244,35 +4993,16 @@
           <w:sz w:val="24"/>
           <w:szCs w:val="24"/>
         </w:rPr>
-      </w:pPr>
-      <w:r>
-        <w:rPr>
-          <w:rFonts w:ascii="Segoe UI Emoji" w:hAnsi="Segoe UI Emoji" w:cs="Segoe UI Emoji"/>
+        <w:t xml:space="preserve"> Structured, sequential approach with well-defined stages:</w:t>
+      </w:r>
+      <w:r>
+        <w:rPr>
+          <w:rFonts w:ascii="Times New Roman" w:hAnsi="Times New Roman" w:cs="Times New Roman"/>
           <w:b/>
           <w:bCs/>
           <w:sz w:val="24"/>
           <w:szCs w:val="24"/>
         </w:rPr>
-        <w:t>✅</w:t>
-      </w:r>
-      <w:r>
-        <w:rPr>
-          <w:rFonts w:ascii="Times New Roman" w:hAnsi="Times New Roman" w:cs="Times New Roman"/>
-          <w:b/>
-          <w:bCs/>
-          <w:sz w:val="24"/>
-          <w:szCs w:val="24"/>
-        </w:rPr>
-        <w:t xml:space="preserve"> Structured, sequential approach with well-defined stages:</w:t>
-      </w:r>
-      <w:r>
-        <w:rPr>
-          <w:rFonts w:ascii="Times New Roman" w:hAnsi="Times New Roman" w:cs="Times New Roman"/>
-          <w:b/>
-          <w:bCs/>
-          <w:sz w:val="24"/>
-          <w:szCs w:val="24"/>
-        </w:rPr>
         <w:br/>
       </w:r>
       <w:r>
@@ -5281,23 +5011,7 @@
           <w:sz w:val="24"/>
           <w:szCs w:val="24"/>
         </w:rPr>
-        <w:t>1️</w:t>
-      </w:r>
-      <w:r>
-        <w:rPr>
-          <w:rFonts w:ascii="Times New Roman" w:hAnsi="Times New Roman" w:cs="Times New Roman"/>
-          <w:sz w:val="24"/>
-          <w:szCs w:val="24"/>
-        </w:rPr>
-        <w:t>.</w:t>
-      </w:r>
-      <w:r>
-        <w:rPr>
-          <w:rFonts w:ascii="Times New Roman" w:hAnsi="Times New Roman" w:cs="Times New Roman"/>
-          <w:sz w:val="24"/>
-          <w:szCs w:val="24"/>
-        </w:rPr>
-        <w:t>Requirement Analysis</w:t>
+        <w:t>1️.Requirement Analysis</w:t>
       </w:r>
       <w:r>
         <w:rPr>
@@ -5306,23 +5020,7 @@
           <w:szCs w:val="24"/>
         </w:rPr>
         <w:br/>
-        <w:t>2️</w:t>
-      </w:r>
-      <w:r>
-        <w:rPr>
-          <w:rFonts w:ascii="Times New Roman" w:hAnsi="Times New Roman" w:cs="Times New Roman"/>
-          <w:sz w:val="24"/>
-          <w:szCs w:val="24"/>
-        </w:rPr>
-        <w:t>.</w:t>
-      </w:r>
-      <w:r>
-        <w:rPr>
-          <w:rFonts w:ascii="Times New Roman" w:hAnsi="Times New Roman" w:cs="Times New Roman"/>
-          <w:sz w:val="24"/>
-          <w:szCs w:val="24"/>
-        </w:rPr>
-        <w:t>Design</w:t>
+        <w:t>2️.Design</w:t>
       </w:r>
       <w:r>
         <w:rPr>
@@ -5331,23 +5029,7 @@
           <w:szCs w:val="24"/>
         </w:rPr>
         <w:br/>
-        <w:t>3️</w:t>
-      </w:r>
-      <w:r>
-        <w:rPr>
-          <w:rFonts w:ascii="Times New Roman" w:hAnsi="Times New Roman" w:cs="Times New Roman"/>
-          <w:sz w:val="24"/>
-          <w:szCs w:val="24"/>
-        </w:rPr>
-        <w:t>.</w:t>
-      </w:r>
-      <w:r>
-        <w:rPr>
-          <w:rFonts w:ascii="Times New Roman" w:hAnsi="Times New Roman" w:cs="Times New Roman"/>
-          <w:sz w:val="24"/>
-          <w:szCs w:val="24"/>
-        </w:rPr>
-        <w:t>Implementation (Coding)</w:t>
+        <w:t>3️.Implementation (Coding)</w:t>
       </w:r>
       <w:r>
         <w:rPr>
@@ -5356,23 +5038,7 @@
           <w:szCs w:val="24"/>
         </w:rPr>
         <w:br/>
-        <w:t>4️</w:t>
-      </w:r>
-      <w:r>
-        <w:rPr>
-          <w:rFonts w:ascii="Times New Roman" w:hAnsi="Times New Roman" w:cs="Times New Roman"/>
-          <w:sz w:val="24"/>
-          <w:szCs w:val="24"/>
-        </w:rPr>
-        <w:t>.</w:t>
-      </w:r>
-      <w:r>
-        <w:rPr>
-          <w:rFonts w:ascii="Times New Roman" w:hAnsi="Times New Roman" w:cs="Times New Roman"/>
-          <w:sz w:val="24"/>
-          <w:szCs w:val="24"/>
-        </w:rPr>
-        <w:t>Testing</w:t>
+        <w:t>4️.Testing</w:t>
       </w:r>
       <w:r>
         <w:rPr>
@@ -5381,23 +5047,7 @@
           <w:szCs w:val="24"/>
         </w:rPr>
         <w:br/>
-        <w:t>5️</w:t>
-      </w:r>
-      <w:r>
-        <w:rPr>
-          <w:rFonts w:ascii="Times New Roman" w:hAnsi="Times New Roman" w:cs="Times New Roman"/>
-          <w:sz w:val="24"/>
-          <w:szCs w:val="24"/>
-        </w:rPr>
-        <w:t>.</w:t>
-      </w:r>
-      <w:r>
-        <w:rPr>
-          <w:rFonts w:ascii="Times New Roman" w:hAnsi="Times New Roman" w:cs="Times New Roman"/>
-          <w:sz w:val="24"/>
-          <w:szCs w:val="24"/>
-        </w:rPr>
-        <w:t>Deployment</w:t>
+        <w:t>5️.Deployment</w:t>
       </w:r>
       <w:r>
         <w:rPr>
@@ -5406,23 +5056,7 @@
           <w:szCs w:val="24"/>
         </w:rPr>
         <w:br/>
-        <w:t>6️</w:t>
-      </w:r>
-      <w:r>
-        <w:rPr>
-          <w:rFonts w:ascii="Times New Roman" w:hAnsi="Times New Roman" w:cs="Times New Roman"/>
-          <w:sz w:val="24"/>
-          <w:szCs w:val="24"/>
-        </w:rPr>
-        <w:t>.</w:t>
-      </w:r>
-      <w:r>
-        <w:rPr>
-          <w:rFonts w:ascii="Times New Roman" w:hAnsi="Times New Roman" w:cs="Times New Roman"/>
-          <w:sz w:val="24"/>
-          <w:szCs w:val="24"/>
-        </w:rPr>
-        <w:t>Maintenance</w:t>
+        <w:t>6️.Maintenance</w:t>
       </w:r>
     </w:p>
     <w:p>
@@ -5806,7 +5440,7 @@
     </w:p>
     <w:p>
       <w:pPr>
-        <w:shd w:val="clear" w:color="auto" w:fill="FFE599" w:themeFill="accent4" w:themeFillTint="66"/>
+        <w:shd w:val="clear" w:color="auto" w:fill="E7E6E6" w:themeFill="background2"/>
         <w:rPr>
           <w:rFonts w:ascii="Times New Roman" w:hAnsi="Times New Roman" w:cs="Times New Roman"/>
           <w:b/>
@@ -5823,190 +5457,7 @@
           <w:sz w:val="24"/>
           <w:szCs w:val="24"/>
         </w:rPr>
-        <w:t>2. IT Operations Challenges Before DevOps</w:t>
-      </w:r>
-    </w:p>
-    <w:p>
-      <w:pPr>
-        <w:rPr>
-          <w:rFonts w:ascii="Times New Roman" w:hAnsi="Times New Roman" w:cs="Times New Roman"/>
-          <w:sz w:val="24"/>
-          <w:szCs w:val="24"/>
-        </w:rPr>
-      </w:pPr>
-      <w:r>
-        <w:rPr>
-          <w:rFonts w:ascii="Times New Roman" w:hAnsi="Times New Roman" w:cs="Times New Roman"/>
-          <w:sz w:val="24"/>
-          <w:szCs w:val="24"/>
-        </w:rPr>
-        <w:t xml:space="preserve">Even with Agile, </w:t>
-      </w:r>
-      <w:r>
-        <w:rPr>
-          <w:rFonts w:ascii="Times New Roman" w:hAnsi="Times New Roman" w:cs="Times New Roman"/>
-          <w:b/>
-          <w:bCs/>
-          <w:sz w:val="24"/>
-          <w:szCs w:val="24"/>
-        </w:rPr>
-        <w:t>IT operations still struggled</w:t>
-      </w:r>
-      <w:r>
-        <w:rPr>
-          <w:rFonts w:ascii="Times New Roman" w:hAnsi="Times New Roman" w:cs="Times New Roman"/>
-          <w:sz w:val="24"/>
-          <w:szCs w:val="24"/>
-        </w:rPr>
-        <w:t xml:space="preserve"> due to:</w:t>
-      </w:r>
-    </w:p>
-    <w:p>
-      <w:pPr>
-        <w:rPr>
-          <w:rFonts w:ascii="Times New Roman" w:hAnsi="Times New Roman" w:cs="Times New Roman"/>
-          <w:sz w:val="24"/>
-          <w:szCs w:val="24"/>
-        </w:rPr>
-      </w:pPr>
-      <w:r>
-        <w:rPr>
-          <w:rFonts w:ascii="Segoe UI Emoji" w:hAnsi="Segoe UI Emoji" w:cs="Segoe UI Emoji"/>
-          <w:sz w:val="24"/>
-          <w:szCs w:val="24"/>
-        </w:rPr>
-        <w:t>🚫</w:t>
-      </w:r>
-      <w:r>
-        <w:rPr>
-          <w:rFonts w:ascii="Times New Roman" w:hAnsi="Times New Roman" w:cs="Times New Roman"/>
-          <w:sz w:val="24"/>
-          <w:szCs w:val="24"/>
-        </w:rPr>
-        <w:t xml:space="preserve"> Slow deployment cycles – Manual infrastructure setup delayed releases.</w:t>
-      </w:r>
-      <w:r>
-        <w:rPr>
-          <w:rFonts w:ascii="Times New Roman" w:hAnsi="Times New Roman" w:cs="Times New Roman"/>
-          <w:sz w:val="24"/>
-          <w:szCs w:val="24"/>
-        </w:rPr>
-        <w:br/>
-      </w:r>
-      <w:r>
-        <w:rPr>
-          <w:rFonts w:ascii="Segoe UI Emoji" w:hAnsi="Segoe UI Emoji" w:cs="Segoe UI Emoji"/>
-          <w:sz w:val="24"/>
-          <w:szCs w:val="24"/>
-        </w:rPr>
-        <w:t>🚫</w:t>
-      </w:r>
-      <w:r>
-        <w:rPr>
-          <w:rFonts w:ascii="Times New Roman" w:hAnsi="Times New Roman" w:cs="Times New Roman"/>
-          <w:sz w:val="24"/>
-          <w:szCs w:val="24"/>
-        </w:rPr>
-        <w:t xml:space="preserve"> Siloed teams – Devs built software, but Ops struggled to deploy it efficiently.</w:t>
-      </w:r>
-      <w:r>
-        <w:rPr>
-          <w:rFonts w:ascii="Times New Roman" w:hAnsi="Times New Roman" w:cs="Times New Roman"/>
-          <w:sz w:val="24"/>
-          <w:szCs w:val="24"/>
-        </w:rPr>
-        <w:br/>
-      </w:r>
-      <w:r>
-        <w:rPr>
-          <w:rFonts w:ascii="Segoe UI Emoji" w:hAnsi="Segoe UI Emoji" w:cs="Segoe UI Emoji"/>
-          <w:sz w:val="24"/>
-          <w:szCs w:val="24"/>
-        </w:rPr>
-        <w:t>🚫</w:t>
-      </w:r>
-      <w:r>
-        <w:rPr>
-          <w:rFonts w:ascii="Times New Roman" w:hAnsi="Times New Roman" w:cs="Times New Roman"/>
-          <w:sz w:val="24"/>
-          <w:szCs w:val="24"/>
-        </w:rPr>
-        <w:t xml:space="preserve"> Lack of automation – Configuration and testing required manual effort.</w:t>
-      </w:r>
-    </w:p>
-    <w:p>
-      <w:pPr>
-        <w:rPr>
-          <w:rFonts w:ascii="Times New Roman" w:hAnsi="Times New Roman" w:cs="Times New Roman"/>
-          <w:sz w:val="24"/>
-          <w:szCs w:val="24"/>
-        </w:rPr>
-      </w:pPr>
-      <w:r>
-        <w:rPr>
-          <w:rFonts w:ascii="Segoe UI Emoji" w:hAnsi="Segoe UI Emoji" w:cs="Segoe UI Emoji"/>
-          <w:sz w:val="24"/>
-          <w:szCs w:val="24"/>
-        </w:rPr>
-        <w:t>🔹</w:t>
-      </w:r>
-      <w:r>
-        <w:rPr>
-          <w:rFonts w:ascii="Times New Roman" w:hAnsi="Times New Roman" w:cs="Times New Roman"/>
-          <w:sz w:val="24"/>
-          <w:szCs w:val="24"/>
-        </w:rPr>
-        <w:t xml:space="preserve"> </w:t>
-      </w:r>
-      <w:r>
-        <w:rPr>
-          <w:rFonts w:ascii="Times New Roman" w:hAnsi="Times New Roman" w:cs="Times New Roman"/>
-          <w:b/>
-          <w:bCs/>
-          <w:sz w:val="24"/>
-          <w:szCs w:val="24"/>
-        </w:rPr>
-        <w:t>Example:</w:t>
-      </w:r>
-      <w:r>
-        <w:rPr>
-          <w:rFonts w:ascii="Times New Roman" w:hAnsi="Times New Roman" w:cs="Times New Roman"/>
-          <w:sz w:val="24"/>
-          <w:szCs w:val="24"/>
-        </w:rPr>
-        <w:br/>
-        <w:t>A video streaming company using Agile could build features quickly, but deployments took weeks due to manual infrastructure provisioning.</w:t>
-      </w:r>
-    </w:p>
-    <w:p>
-      <w:pPr>
-        <w:rPr>
-          <w:rFonts w:ascii="Times New Roman" w:hAnsi="Times New Roman" w:cs="Times New Roman"/>
-          <w:sz w:val="24"/>
-          <w:szCs w:val="24"/>
-        </w:rPr>
-      </w:pPr>
-    </w:p>
-    <w:p>
-      <w:pPr>
-        <w:shd w:val="clear" w:color="auto" w:fill="FFE599" w:themeFill="accent4" w:themeFillTint="66"/>
-        <w:rPr>
-          <w:rFonts w:ascii="Times New Roman" w:hAnsi="Times New Roman" w:cs="Times New Roman"/>
-          <w:b/>
-          <w:bCs/>
-          <w:sz w:val="24"/>
-          <w:szCs w:val="24"/>
-        </w:rPr>
-      </w:pPr>
-      <w:r>
-        <w:rPr>
-          <w:rFonts w:ascii="Times New Roman" w:hAnsi="Times New Roman" w:cs="Times New Roman"/>
-          <w:b/>
-          <w:bCs/>
-          <w:sz w:val="24"/>
-          <w:szCs w:val="24"/>
-        </w:rPr>
-        <w:t xml:space="preserve">3. The Rise of DevOps (2010s - Present) </w:t>
+        <w:t xml:space="preserve">Key Principles of Agile </w:t>
       </w:r>
       <w:r>
         <w:rPr>
@@ -6029,10 +5480,85 @@
       </w:pPr>
       <w:r>
         <w:rPr>
+          <w:rFonts w:ascii="Times New Roman" w:hAnsi="Times New Roman" w:cs="Times New Roman"/>
+          <w:sz w:val="24"/>
+          <w:szCs w:val="24"/>
+        </w:rPr>
+        <w:t>Agile is a flexible, iterative approach to software development that emphasizes customer collaboration, adaptability, and faster delivery. It was introduced in the Agile Manifesto (2001) to overcome the limitations of traditional Waterfall development.</w:t>
+      </w:r>
+    </w:p>
+    <w:p>
+      <w:pPr>
+        <w:shd w:val="clear" w:color="auto" w:fill="FFF2CC" w:themeFill="accent4" w:themeFillTint="33"/>
+        <w:rPr>
+          <w:rFonts w:ascii="Times New Roman" w:hAnsi="Times New Roman" w:cs="Times New Roman"/>
+          <w:sz w:val="24"/>
+          <w:szCs w:val="24"/>
+        </w:rPr>
+      </w:pPr>
+      <w:r>
+        <w:rPr>
+          <w:rFonts w:ascii="Times New Roman" w:hAnsi="Times New Roman" w:cs="Times New Roman"/>
+          <w:sz w:val="24"/>
+          <w:szCs w:val="24"/>
+        </w:rPr>
+        <w:t>1</w:t>
+      </w:r>
+      <w:r>
+        <w:rPr>
+          <w:rFonts w:ascii="Times New Roman" w:hAnsi="Times New Roman" w:cs="Times New Roman"/>
+          <w:sz w:val="24"/>
+          <w:szCs w:val="24"/>
+        </w:rPr>
+        <w:t>️</w:t>
+      </w:r>
+      <w:r>
+        <w:rPr>
+          <w:rFonts w:ascii="Times New Roman" w:hAnsi="Times New Roman" w:cs="Times New Roman"/>
+          <w:sz w:val="24"/>
+          <w:szCs w:val="24"/>
+        </w:rPr>
+        <w:t>.</w:t>
+      </w:r>
+      <w:r>
+        <w:rPr>
+          <w:rFonts w:ascii="Times New Roman" w:hAnsi="Times New Roman" w:cs="Times New Roman"/>
+          <w:sz w:val="24"/>
+          <w:szCs w:val="24"/>
+        </w:rPr>
+        <w:t xml:space="preserve"> Iterative</w:t>
+      </w:r>
+      <w:r>
+        <w:rPr>
+          <w:rFonts w:ascii="Times New Roman" w:hAnsi="Times New Roman" w:cs="Times New Roman"/>
+          <w:sz w:val="24"/>
+          <w:szCs w:val="24"/>
+        </w:rPr>
+        <w:t xml:space="preserve"> Development </w:t>
+      </w:r>
+      <w:r>
+        <w:rPr>
           <w:rFonts w:ascii="Segoe UI Emoji" w:hAnsi="Segoe UI Emoji" w:cs="Segoe UI Emoji"/>
           <w:sz w:val="24"/>
           <w:szCs w:val="24"/>
         </w:rPr>
+        <w:t>🔄</w:t>
+      </w:r>
+    </w:p>
+    <w:p>
+      <w:pPr>
+        <w:rPr>
+          <w:rFonts w:ascii="Times New Roman" w:hAnsi="Times New Roman" w:cs="Times New Roman"/>
+          <w:sz w:val="24"/>
+          <w:szCs w:val="24"/>
+        </w:rPr>
+      </w:pPr>
+      <w:r>
+        <w:rPr>
+          <w:rFonts w:ascii="Segoe UI Emoji" w:hAnsi="Segoe UI Emoji" w:cs="Segoe UI Emoji"/>
+          <w:sz w:val="24"/>
+          <w:szCs w:val="24"/>
+        </w:rPr>
         <w:t>✅</w:t>
       </w:r>
       <w:r>
@@ -6041,7 +5567,7 @@
           <w:sz w:val="24"/>
           <w:szCs w:val="24"/>
         </w:rPr>
-        <w:t xml:space="preserve"> DevOps bridges the gap between Development (Dev) and IT Operations (Ops).</w:t>
+        <w:t xml:space="preserve"> Software is developed in small, incremental cycles (sprints).</w:t>
       </w:r>
       <w:r>
         <w:rPr>
@@ -6065,25 +5591,7 @@
           <w:sz w:val="24"/>
           <w:szCs w:val="24"/>
         </w:rPr>
-        <w:t xml:space="preserve"> Introduces automation, CI/CD pipelines, and Infrastructure as Code (</w:t>
-      </w:r>
-      <w:proofErr w:type="spellStart"/>
-      <w:r>
-        <w:rPr>
-          <w:rFonts w:ascii="Times New Roman" w:hAnsi="Times New Roman" w:cs="Times New Roman"/>
-          <w:sz w:val="24"/>
-          <w:szCs w:val="24"/>
-        </w:rPr>
-        <w:t>IaC</w:t>
-      </w:r>
-      <w:proofErr w:type="spellEnd"/>
-      <w:r>
-        <w:rPr>
-          <w:rFonts w:ascii="Times New Roman" w:hAnsi="Times New Roman" w:cs="Times New Roman"/>
-          <w:sz w:val="24"/>
-          <w:szCs w:val="24"/>
-        </w:rPr>
-        <w:t>).</w:t>
+        <w:t xml:space="preserve"> Each iteration produces a working product that can be tested and improved.</w:t>
       </w:r>
       <w:r>
         <w:rPr>
@@ -6107,7 +5615,7 @@
           <w:sz w:val="24"/>
           <w:szCs w:val="24"/>
         </w:rPr>
-        <w:t xml:space="preserve"> Enables faster releases, improved collaboration, and reliability.</w:t>
+        <w:t xml:space="preserve"> Encourages continuous feedback and refinement.</w:t>
       </w:r>
     </w:p>
     <w:p>
@@ -6142,6 +5650,1726 @@
           <w:sz w:val="24"/>
           <w:szCs w:val="24"/>
         </w:rPr>
+        <w:t>Example:</w:t>
+      </w:r>
+    </w:p>
+    <w:p>
+      <w:pPr>
+        <w:numPr>
+          <w:ilvl w:val="0"/>
+          <w:numId w:val="34"/>
+        </w:numPr>
+        <w:rPr>
+          <w:rFonts w:ascii="Times New Roman" w:hAnsi="Times New Roman" w:cs="Times New Roman"/>
+          <w:sz w:val="24"/>
+          <w:szCs w:val="24"/>
+        </w:rPr>
+      </w:pPr>
+      <w:r>
+        <w:rPr>
+          <w:rFonts w:ascii="Times New Roman" w:hAnsi="Times New Roman" w:cs="Times New Roman"/>
+          <w:sz w:val="24"/>
+          <w:szCs w:val="24"/>
+        </w:rPr>
+        <w:t>Instead of waiting months for a final release, a new feature is delivered every 2-4 weeks.</w:t>
+      </w:r>
+    </w:p>
+    <w:p>
+      <w:pPr>
+        <w:numPr>
+          <w:ilvl w:val="0"/>
+          <w:numId w:val="34"/>
+        </w:numPr>
+        <w:rPr>
+          <w:rFonts w:ascii="Times New Roman" w:hAnsi="Times New Roman" w:cs="Times New Roman"/>
+          <w:sz w:val="24"/>
+          <w:szCs w:val="24"/>
+        </w:rPr>
+      </w:pPr>
+      <w:r>
+        <w:rPr>
+          <w:rFonts w:ascii="Times New Roman" w:hAnsi="Times New Roman" w:cs="Times New Roman"/>
+          <w:sz w:val="24"/>
+          <w:szCs w:val="24"/>
+        </w:rPr>
+        <w:t>Scrum teams hold daily stand-ups to review progress and adjust plans.</w:t>
+      </w:r>
+    </w:p>
+    <w:p>
+      <w:pPr>
+        <w:rPr>
+          <w:rFonts w:ascii="Times New Roman" w:hAnsi="Times New Roman" w:cs="Times New Roman"/>
+          <w:sz w:val="24"/>
+          <w:szCs w:val="24"/>
+        </w:rPr>
+      </w:pPr>
+      <w:r>
+        <w:rPr>
+          <w:rFonts w:ascii="Segoe UI Emoji" w:hAnsi="Segoe UI Emoji" w:cs="Segoe UI Emoji"/>
+          <w:sz w:val="24"/>
+          <w:szCs w:val="24"/>
+        </w:rPr>
+        <w:t>🔹</w:t>
+      </w:r>
+      <w:r>
+        <w:rPr>
+          <w:rFonts w:ascii="Times New Roman" w:hAnsi="Times New Roman" w:cs="Times New Roman"/>
+          <w:sz w:val="24"/>
+          <w:szCs w:val="24"/>
+        </w:rPr>
+        <w:t xml:space="preserve"> </w:t>
+      </w:r>
+      <w:r>
+        <w:rPr>
+          <w:rFonts w:ascii="Times New Roman" w:hAnsi="Times New Roman" w:cs="Times New Roman"/>
+          <w:b/>
+          <w:bCs/>
+          <w:sz w:val="24"/>
+          <w:szCs w:val="24"/>
+        </w:rPr>
+        <w:t>Frameworks Used:</w:t>
+      </w:r>
+      <w:r>
+        <w:rPr>
+          <w:rFonts w:ascii="Times New Roman" w:hAnsi="Times New Roman" w:cs="Times New Roman"/>
+          <w:sz w:val="24"/>
+          <w:szCs w:val="24"/>
+        </w:rPr>
+        <w:t xml:space="preserve"> Scrum, Kanban, SAFe</w:t>
+      </w:r>
+    </w:p>
+    <w:p>
+      <w:pPr>
+        <w:shd w:val="clear" w:color="auto" w:fill="FFF2CC" w:themeFill="accent4" w:themeFillTint="33"/>
+        <w:rPr>
+          <w:rFonts w:ascii="Times New Roman" w:hAnsi="Times New Roman" w:cs="Times New Roman"/>
+          <w:sz w:val="24"/>
+          <w:szCs w:val="24"/>
+        </w:rPr>
+      </w:pPr>
+      <w:r>
+        <w:rPr>
+          <w:rFonts w:ascii="Times New Roman" w:hAnsi="Times New Roman" w:cs="Times New Roman"/>
+          <w:sz w:val="24"/>
+          <w:szCs w:val="24"/>
+        </w:rPr>
+        <w:t>2</w:t>
+      </w:r>
+      <w:r>
+        <w:rPr>
+          <w:rFonts w:ascii="Times New Roman" w:hAnsi="Times New Roman" w:cs="Times New Roman"/>
+          <w:sz w:val="24"/>
+          <w:szCs w:val="24"/>
+        </w:rPr>
+        <w:t>️</w:t>
+      </w:r>
+      <w:r>
+        <w:rPr>
+          <w:rFonts w:ascii="Segoe UI Symbol" w:hAnsi="Segoe UI Symbol" w:cs="Segoe UI Symbol"/>
+          <w:sz w:val="24"/>
+          <w:szCs w:val="24"/>
+        </w:rPr>
+        <w:t>.</w:t>
+      </w:r>
+      <w:r>
+        <w:rPr>
+          <w:rFonts w:ascii="Times New Roman" w:hAnsi="Times New Roman" w:cs="Times New Roman"/>
+          <w:sz w:val="24"/>
+          <w:szCs w:val="24"/>
+        </w:rPr>
+        <w:t xml:space="preserve"> Customer</w:t>
+      </w:r>
+      <w:r>
+        <w:rPr>
+          <w:rFonts w:ascii="Times New Roman" w:hAnsi="Times New Roman" w:cs="Times New Roman"/>
+          <w:sz w:val="24"/>
+          <w:szCs w:val="24"/>
+        </w:rPr>
+        <w:t xml:space="preserve"> Collaboration </w:t>
+      </w:r>
+      <w:r>
+        <w:rPr>
+          <w:rFonts w:ascii="Segoe UI Emoji" w:hAnsi="Segoe UI Emoji" w:cs="Segoe UI Emoji"/>
+          <w:sz w:val="24"/>
+          <w:szCs w:val="24"/>
+        </w:rPr>
+        <w:t>🤝</w:t>
+      </w:r>
+    </w:p>
+    <w:p>
+      <w:pPr>
+        <w:rPr>
+          <w:rFonts w:ascii="Times New Roman" w:hAnsi="Times New Roman" w:cs="Times New Roman"/>
+          <w:sz w:val="24"/>
+          <w:szCs w:val="24"/>
+        </w:rPr>
+      </w:pPr>
+      <w:r>
+        <w:rPr>
+          <w:rFonts w:ascii="Segoe UI Emoji" w:hAnsi="Segoe UI Emoji" w:cs="Segoe UI Emoji"/>
+          <w:sz w:val="24"/>
+          <w:szCs w:val="24"/>
+        </w:rPr>
+        <w:t>✅</w:t>
+      </w:r>
+      <w:r>
+        <w:rPr>
+          <w:rFonts w:ascii="Times New Roman" w:hAnsi="Times New Roman" w:cs="Times New Roman"/>
+          <w:sz w:val="24"/>
+          <w:szCs w:val="24"/>
+        </w:rPr>
+        <w:t xml:space="preserve"> Agile teams work closely with customers &amp; stakeholders.</w:t>
+      </w:r>
+      <w:r>
+        <w:rPr>
+          <w:rFonts w:ascii="Times New Roman" w:hAnsi="Times New Roman" w:cs="Times New Roman"/>
+          <w:sz w:val="24"/>
+          <w:szCs w:val="24"/>
+        </w:rPr>
+        <w:br/>
+      </w:r>
+      <w:r>
+        <w:rPr>
+          <w:rFonts w:ascii="Segoe UI Emoji" w:hAnsi="Segoe UI Emoji" w:cs="Segoe UI Emoji"/>
+          <w:sz w:val="24"/>
+          <w:szCs w:val="24"/>
+        </w:rPr>
+        <w:t>✅</w:t>
+      </w:r>
+      <w:r>
+        <w:rPr>
+          <w:rFonts w:ascii="Times New Roman" w:hAnsi="Times New Roman" w:cs="Times New Roman"/>
+          <w:sz w:val="24"/>
+          <w:szCs w:val="24"/>
+        </w:rPr>
+        <w:t xml:space="preserve"> Customer feedback is continuously incorporated into development.</w:t>
+      </w:r>
+      <w:r>
+        <w:rPr>
+          <w:rFonts w:ascii="Times New Roman" w:hAnsi="Times New Roman" w:cs="Times New Roman"/>
+          <w:sz w:val="24"/>
+          <w:szCs w:val="24"/>
+        </w:rPr>
+        <w:br/>
+      </w:r>
+      <w:r>
+        <w:rPr>
+          <w:rFonts w:ascii="Segoe UI Emoji" w:hAnsi="Segoe UI Emoji" w:cs="Segoe UI Emoji"/>
+          <w:sz w:val="24"/>
+          <w:szCs w:val="24"/>
+        </w:rPr>
+        <w:t>✅</w:t>
+      </w:r>
+      <w:r>
+        <w:rPr>
+          <w:rFonts w:ascii="Times New Roman" w:hAnsi="Times New Roman" w:cs="Times New Roman"/>
+          <w:sz w:val="24"/>
+          <w:szCs w:val="24"/>
+        </w:rPr>
+        <w:t xml:space="preserve"> Reduces the risk of building the wrong product.</w:t>
+      </w:r>
+    </w:p>
+    <w:p>
+      <w:pPr>
+        <w:rPr>
+          <w:rFonts w:ascii="Times New Roman" w:hAnsi="Times New Roman" w:cs="Times New Roman"/>
+          <w:sz w:val="24"/>
+          <w:szCs w:val="24"/>
+        </w:rPr>
+      </w:pPr>
+      <w:r>
+        <w:rPr>
+          <w:rFonts w:ascii="Segoe UI Emoji" w:hAnsi="Segoe UI Emoji" w:cs="Segoe UI Emoji"/>
+          <w:sz w:val="24"/>
+          <w:szCs w:val="24"/>
+        </w:rPr>
+        <w:t>🔹</w:t>
+      </w:r>
+      <w:r>
+        <w:rPr>
+          <w:rFonts w:ascii="Times New Roman" w:hAnsi="Times New Roman" w:cs="Times New Roman"/>
+          <w:sz w:val="24"/>
+          <w:szCs w:val="24"/>
+        </w:rPr>
+        <w:t xml:space="preserve"> </w:t>
+      </w:r>
+      <w:r>
+        <w:rPr>
+          <w:rFonts w:ascii="Times New Roman" w:hAnsi="Times New Roman" w:cs="Times New Roman"/>
+          <w:b/>
+          <w:bCs/>
+          <w:sz w:val="24"/>
+          <w:szCs w:val="24"/>
+        </w:rPr>
+        <w:t>Example:</w:t>
+      </w:r>
+    </w:p>
+    <w:p>
+      <w:pPr>
+        <w:numPr>
+          <w:ilvl w:val="0"/>
+          <w:numId w:val="35"/>
+        </w:numPr>
+        <w:rPr>
+          <w:rFonts w:ascii="Times New Roman" w:hAnsi="Times New Roman" w:cs="Times New Roman"/>
+          <w:sz w:val="24"/>
+          <w:szCs w:val="24"/>
+        </w:rPr>
+      </w:pPr>
+      <w:r>
+        <w:rPr>
+          <w:rFonts w:ascii="Times New Roman" w:hAnsi="Times New Roman" w:cs="Times New Roman"/>
+          <w:sz w:val="24"/>
+          <w:szCs w:val="24"/>
+        </w:rPr>
+        <w:t>Spotify regularly gathers user feedback to improve its recommendation algorithm.</w:t>
+      </w:r>
+    </w:p>
+    <w:p>
+      <w:pPr>
+        <w:numPr>
+          <w:ilvl w:val="0"/>
+          <w:numId w:val="35"/>
+        </w:numPr>
+        <w:rPr>
+          <w:rFonts w:ascii="Times New Roman" w:hAnsi="Times New Roman" w:cs="Times New Roman"/>
+          <w:sz w:val="24"/>
+          <w:szCs w:val="24"/>
+        </w:rPr>
+      </w:pPr>
+      <w:r>
+        <w:rPr>
+          <w:rFonts w:ascii="Times New Roman" w:hAnsi="Times New Roman" w:cs="Times New Roman"/>
+          <w:sz w:val="24"/>
+          <w:szCs w:val="24"/>
+        </w:rPr>
+        <w:t>Amazon launches A/B tests to understand what users prefer before full rollout.</w:t>
+      </w:r>
+    </w:p>
+    <w:p>
+      <w:pPr>
+        <w:rPr>
+          <w:rFonts w:ascii="Times New Roman" w:hAnsi="Times New Roman" w:cs="Times New Roman"/>
+          <w:sz w:val="24"/>
+          <w:szCs w:val="24"/>
+        </w:rPr>
+      </w:pPr>
+      <w:r>
+        <w:rPr>
+          <w:rFonts w:ascii="Segoe UI Emoji" w:hAnsi="Segoe UI Emoji" w:cs="Segoe UI Emoji"/>
+          <w:sz w:val="24"/>
+          <w:szCs w:val="24"/>
+        </w:rPr>
+        <w:t>🔹</w:t>
+      </w:r>
+      <w:r>
+        <w:rPr>
+          <w:rFonts w:ascii="Times New Roman" w:hAnsi="Times New Roman" w:cs="Times New Roman"/>
+          <w:sz w:val="24"/>
+          <w:szCs w:val="24"/>
+        </w:rPr>
+        <w:t xml:space="preserve"> </w:t>
+      </w:r>
+      <w:r>
+        <w:rPr>
+          <w:rFonts w:ascii="Times New Roman" w:hAnsi="Times New Roman" w:cs="Times New Roman"/>
+          <w:b/>
+          <w:bCs/>
+          <w:sz w:val="24"/>
+          <w:szCs w:val="24"/>
+        </w:rPr>
+        <w:t>Agile Practice:</w:t>
+      </w:r>
+      <w:r>
+        <w:rPr>
+          <w:rFonts w:ascii="Times New Roman" w:hAnsi="Times New Roman" w:cs="Times New Roman"/>
+          <w:sz w:val="24"/>
+          <w:szCs w:val="24"/>
+        </w:rPr>
+        <w:t xml:space="preserve"> User stories, feedback loops, product demos</w:t>
+      </w:r>
+    </w:p>
+    <w:p>
+      <w:pPr>
+        <w:shd w:val="clear" w:color="auto" w:fill="FFF2CC" w:themeFill="accent4" w:themeFillTint="33"/>
+        <w:rPr>
+          <w:rFonts w:ascii="Times New Roman" w:hAnsi="Times New Roman" w:cs="Times New Roman"/>
+          <w:b/>
+          <w:bCs/>
+          <w:sz w:val="24"/>
+          <w:szCs w:val="24"/>
+        </w:rPr>
+      </w:pPr>
+      <w:r>
+        <w:rPr>
+          <w:rFonts w:ascii="Times New Roman" w:hAnsi="Times New Roman" w:cs="Times New Roman"/>
+          <w:b/>
+          <w:bCs/>
+          <w:sz w:val="24"/>
+          <w:szCs w:val="24"/>
+        </w:rPr>
+        <w:t>3</w:t>
+      </w:r>
+      <w:r>
+        <w:rPr>
+          <w:rFonts w:ascii="Times New Roman" w:hAnsi="Times New Roman" w:cs="Times New Roman"/>
+          <w:b/>
+          <w:bCs/>
+          <w:sz w:val="24"/>
+          <w:szCs w:val="24"/>
+        </w:rPr>
+        <w:t>️</w:t>
+      </w:r>
+      <w:r>
+        <w:rPr>
+          <w:rFonts w:ascii="Segoe UI Symbol" w:hAnsi="Segoe UI Symbol" w:cs="Segoe UI Symbol"/>
+          <w:b/>
+          <w:bCs/>
+          <w:sz w:val="24"/>
+          <w:szCs w:val="24"/>
+        </w:rPr>
+        <w:t>.</w:t>
+      </w:r>
+      <w:r>
+        <w:rPr>
+          <w:rFonts w:ascii="Times New Roman" w:hAnsi="Times New Roman" w:cs="Times New Roman"/>
+          <w:b/>
+          <w:bCs/>
+          <w:sz w:val="24"/>
+          <w:szCs w:val="24"/>
+        </w:rPr>
+        <w:t xml:space="preserve"> Adaptability</w:t>
+      </w:r>
+      <w:r>
+        <w:rPr>
+          <w:rFonts w:ascii="Times New Roman" w:hAnsi="Times New Roman" w:cs="Times New Roman"/>
+          <w:b/>
+          <w:bCs/>
+          <w:sz w:val="24"/>
+          <w:szCs w:val="24"/>
+        </w:rPr>
+        <w:t xml:space="preserve"> </w:t>
+      </w:r>
+      <w:r>
+        <w:rPr>
+          <w:rFonts w:ascii="Segoe UI Emoji" w:hAnsi="Segoe UI Emoji" w:cs="Segoe UI Emoji"/>
+          <w:b/>
+          <w:bCs/>
+          <w:sz w:val="24"/>
+          <w:szCs w:val="24"/>
+        </w:rPr>
+        <w:t>🔄</w:t>
+      </w:r>
+    </w:p>
+    <w:p>
+      <w:pPr>
+        <w:rPr>
+          <w:rFonts w:ascii="Times New Roman" w:hAnsi="Times New Roman" w:cs="Times New Roman"/>
+          <w:sz w:val="24"/>
+          <w:szCs w:val="24"/>
+        </w:rPr>
+      </w:pPr>
+      <w:r>
+        <w:rPr>
+          <w:rFonts w:ascii="Segoe UI Emoji" w:hAnsi="Segoe UI Emoji" w:cs="Segoe UI Emoji"/>
+          <w:sz w:val="24"/>
+          <w:szCs w:val="24"/>
+        </w:rPr>
+        <w:t>✅</w:t>
+      </w:r>
+      <w:r>
+        <w:rPr>
+          <w:rFonts w:ascii="Times New Roman" w:hAnsi="Times New Roman" w:cs="Times New Roman"/>
+          <w:sz w:val="24"/>
+          <w:szCs w:val="24"/>
+        </w:rPr>
+        <w:t xml:space="preserve"> Agile embraces change at any stage of development.</w:t>
+      </w:r>
+      <w:r>
+        <w:rPr>
+          <w:rFonts w:ascii="Times New Roman" w:hAnsi="Times New Roman" w:cs="Times New Roman"/>
+          <w:sz w:val="24"/>
+          <w:szCs w:val="24"/>
+        </w:rPr>
+        <w:br/>
+      </w:r>
+      <w:r>
+        <w:rPr>
+          <w:rFonts w:ascii="Segoe UI Emoji" w:hAnsi="Segoe UI Emoji" w:cs="Segoe UI Emoji"/>
+          <w:sz w:val="24"/>
+          <w:szCs w:val="24"/>
+        </w:rPr>
+        <w:t>✅</w:t>
+      </w:r>
+      <w:r>
+        <w:rPr>
+          <w:rFonts w:ascii="Times New Roman" w:hAnsi="Times New Roman" w:cs="Times New Roman"/>
+          <w:sz w:val="24"/>
+          <w:szCs w:val="24"/>
+        </w:rPr>
+        <w:t xml:space="preserve"> If requirements shift, the team can quickly pivot without major delays.</w:t>
+      </w:r>
+      <w:r>
+        <w:rPr>
+          <w:rFonts w:ascii="Times New Roman" w:hAnsi="Times New Roman" w:cs="Times New Roman"/>
+          <w:sz w:val="24"/>
+          <w:szCs w:val="24"/>
+        </w:rPr>
+        <w:br/>
+      </w:r>
+      <w:r>
+        <w:rPr>
+          <w:rFonts w:ascii="Segoe UI Emoji" w:hAnsi="Segoe UI Emoji" w:cs="Segoe UI Emoji"/>
+          <w:sz w:val="24"/>
+          <w:szCs w:val="24"/>
+        </w:rPr>
+        <w:t>✅</w:t>
+      </w:r>
+      <w:r>
+        <w:rPr>
+          <w:rFonts w:ascii="Times New Roman" w:hAnsi="Times New Roman" w:cs="Times New Roman"/>
+          <w:sz w:val="24"/>
+          <w:szCs w:val="24"/>
+        </w:rPr>
+        <w:t xml:space="preserve"> Encourages frequent re-evaluation of priorities.</w:t>
+      </w:r>
+    </w:p>
+    <w:p>
+      <w:pPr>
+        <w:rPr>
+          <w:rFonts w:ascii="Times New Roman" w:hAnsi="Times New Roman" w:cs="Times New Roman"/>
+          <w:sz w:val="24"/>
+          <w:szCs w:val="24"/>
+        </w:rPr>
+      </w:pPr>
+      <w:r>
+        <w:rPr>
+          <w:rFonts w:ascii="Segoe UI Emoji" w:hAnsi="Segoe UI Emoji" w:cs="Segoe UI Emoji"/>
+          <w:sz w:val="24"/>
+          <w:szCs w:val="24"/>
+        </w:rPr>
+        <w:t>🔹</w:t>
+      </w:r>
+      <w:r>
+        <w:rPr>
+          <w:rFonts w:ascii="Times New Roman" w:hAnsi="Times New Roman" w:cs="Times New Roman"/>
+          <w:sz w:val="24"/>
+          <w:szCs w:val="24"/>
+        </w:rPr>
+        <w:t xml:space="preserve"> </w:t>
+      </w:r>
+      <w:r>
+        <w:rPr>
+          <w:rFonts w:ascii="Times New Roman" w:hAnsi="Times New Roman" w:cs="Times New Roman"/>
+          <w:b/>
+          <w:bCs/>
+          <w:sz w:val="24"/>
+          <w:szCs w:val="24"/>
+        </w:rPr>
+        <w:t>Example:</w:t>
+      </w:r>
+    </w:p>
+    <w:p>
+      <w:pPr>
+        <w:numPr>
+          <w:ilvl w:val="0"/>
+          <w:numId w:val="36"/>
+        </w:numPr>
+        <w:rPr>
+          <w:rFonts w:ascii="Times New Roman" w:hAnsi="Times New Roman" w:cs="Times New Roman"/>
+          <w:sz w:val="24"/>
+          <w:szCs w:val="24"/>
+        </w:rPr>
+      </w:pPr>
+      <w:r>
+        <w:rPr>
+          <w:rFonts w:ascii="Times New Roman" w:hAnsi="Times New Roman" w:cs="Times New Roman"/>
+          <w:sz w:val="24"/>
+          <w:szCs w:val="24"/>
+        </w:rPr>
+        <w:t>Twitter initially started as a podcast platform but adapted into a social media app.</w:t>
+      </w:r>
+    </w:p>
+    <w:p>
+      <w:pPr>
+        <w:numPr>
+          <w:ilvl w:val="0"/>
+          <w:numId w:val="36"/>
+        </w:numPr>
+        <w:rPr>
+          <w:rFonts w:ascii="Times New Roman" w:hAnsi="Times New Roman" w:cs="Times New Roman"/>
+          <w:sz w:val="24"/>
+          <w:szCs w:val="24"/>
+        </w:rPr>
+      </w:pPr>
+      <w:r>
+        <w:rPr>
+          <w:rFonts w:ascii="Times New Roman" w:hAnsi="Times New Roman" w:cs="Times New Roman"/>
+          <w:sz w:val="24"/>
+          <w:szCs w:val="24"/>
+        </w:rPr>
+        <w:t>Tesla updates its car software remotely, adding features based on user needs.</w:t>
+      </w:r>
+    </w:p>
+    <w:p>
+      <w:pPr>
+        <w:rPr>
+          <w:rFonts w:ascii="Times New Roman" w:hAnsi="Times New Roman" w:cs="Times New Roman"/>
+          <w:sz w:val="24"/>
+          <w:szCs w:val="24"/>
+        </w:rPr>
+      </w:pPr>
+      <w:r>
+        <w:rPr>
+          <w:rFonts w:ascii="Segoe UI Emoji" w:hAnsi="Segoe UI Emoji" w:cs="Segoe UI Emoji"/>
+          <w:sz w:val="24"/>
+          <w:szCs w:val="24"/>
+        </w:rPr>
+        <w:t>🔹</w:t>
+      </w:r>
+      <w:r>
+        <w:rPr>
+          <w:rFonts w:ascii="Times New Roman" w:hAnsi="Times New Roman" w:cs="Times New Roman"/>
+          <w:sz w:val="24"/>
+          <w:szCs w:val="24"/>
+        </w:rPr>
+        <w:t xml:space="preserve"> </w:t>
+      </w:r>
+      <w:r>
+        <w:rPr>
+          <w:rFonts w:ascii="Times New Roman" w:hAnsi="Times New Roman" w:cs="Times New Roman"/>
+          <w:b/>
+          <w:bCs/>
+          <w:sz w:val="24"/>
+          <w:szCs w:val="24"/>
+        </w:rPr>
+        <w:t>Agile Practice:</w:t>
+      </w:r>
+      <w:r>
+        <w:rPr>
+          <w:rFonts w:ascii="Times New Roman" w:hAnsi="Times New Roman" w:cs="Times New Roman"/>
+          <w:sz w:val="24"/>
+          <w:szCs w:val="24"/>
+        </w:rPr>
+        <w:t xml:space="preserve"> Backlog refinement, sprint reviews, retrospective meetings</w:t>
+      </w:r>
+    </w:p>
+    <w:p>
+      <w:pPr>
+        <w:shd w:val="clear" w:color="auto" w:fill="FFF2CC" w:themeFill="accent4" w:themeFillTint="33"/>
+        <w:rPr>
+          <w:rFonts w:ascii="Times New Roman" w:hAnsi="Times New Roman" w:cs="Times New Roman"/>
+          <w:b/>
+          <w:bCs/>
+          <w:sz w:val="24"/>
+          <w:szCs w:val="24"/>
+        </w:rPr>
+      </w:pPr>
+      <w:r>
+        <w:rPr>
+          <w:rFonts w:ascii="Times New Roman" w:hAnsi="Times New Roman" w:cs="Times New Roman"/>
+          <w:b/>
+          <w:bCs/>
+          <w:sz w:val="24"/>
+          <w:szCs w:val="24"/>
+        </w:rPr>
+        <w:t>4</w:t>
+      </w:r>
+      <w:r>
+        <w:rPr>
+          <w:rFonts w:ascii="Times New Roman" w:hAnsi="Times New Roman" w:cs="Times New Roman"/>
+          <w:b/>
+          <w:bCs/>
+          <w:sz w:val="24"/>
+          <w:szCs w:val="24"/>
+        </w:rPr>
+        <w:t>️</w:t>
+      </w:r>
+      <w:r>
+        <w:rPr>
+          <w:rFonts w:ascii="Segoe UI Symbol" w:hAnsi="Segoe UI Symbol" w:cs="Segoe UI Symbol"/>
+          <w:b/>
+          <w:bCs/>
+          <w:sz w:val="24"/>
+          <w:szCs w:val="24"/>
+        </w:rPr>
+        <w:t>.</w:t>
+      </w:r>
+      <w:r>
+        <w:rPr>
+          <w:rFonts w:ascii="Times New Roman" w:hAnsi="Times New Roman" w:cs="Times New Roman"/>
+          <w:b/>
+          <w:bCs/>
+          <w:sz w:val="24"/>
+          <w:szCs w:val="24"/>
+        </w:rPr>
+        <w:t xml:space="preserve"> Faster</w:t>
+      </w:r>
+      <w:r>
+        <w:rPr>
+          <w:rFonts w:ascii="Times New Roman" w:hAnsi="Times New Roman" w:cs="Times New Roman"/>
+          <w:b/>
+          <w:bCs/>
+          <w:sz w:val="24"/>
+          <w:szCs w:val="24"/>
+        </w:rPr>
+        <w:t xml:space="preserve"> Delivery </w:t>
+      </w:r>
+      <w:r>
+        <w:rPr>
+          <w:rFonts w:ascii="Segoe UI Emoji" w:hAnsi="Segoe UI Emoji" w:cs="Segoe UI Emoji"/>
+          <w:b/>
+          <w:bCs/>
+          <w:sz w:val="24"/>
+          <w:szCs w:val="24"/>
+        </w:rPr>
+        <w:t>⚡</w:t>
+      </w:r>
+    </w:p>
+    <w:p>
+      <w:pPr>
+        <w:rPr>
+          <w:rFonts w:ascii="Times New Roman" w:hAnsi="Times New Roman" w:cs="Times New Roman"/>
+          <w:sz w:val="24"/>
+          <w:szCs w:val="24"/>
+        </w:rPr>
+      </w:pPr>
+      <w:r>
+        <w:rPr>
+          <w:rFonts w:ascii="Segoe UI Emoji" w:hAnsi="Segoe UI Emoji" w:cs="Segoe UI Emoji"/>
+          <w:sz w:val="24"/>
+          <w:szCs w:val="24"/>
+        </w:rPr>
+        <w:t>✅</w:t>
+      </w:r>
+      <w:r>
+        <w:rPr>
+          <w:rFonts w:ascii="Times New Roman" w:hAnsi="Times New Roman" w:cs="Times New Roman"/>
+          <w:sz w:val="24"/>
+          <w:szCs w:val="24"/>
+        </w:rPr>
+        <w:t xml:space="preserve"> Agile teams deliver small, frequent releases instead of waiting for a big launch.</w:t>
+      </w:r>
+      <w:r>
+        <w:rPr>
+          <w:rFonts w:ascii="Times New Roman" w:hAnsi="Times New Roman" w:cs="Times New Roman"/>
+          <w:sz w:val="24"/>
+          <w:szCs w:val="24"/>
+        </w:rPr>
+        <w:br/>
+      </w:r>
+      <w:r>
+        <w:rPr>
+          <w:rFonts w:ascii="Segoe UI Emoji" w:hAnsi="Segoe UI Emoji" w:cs="Segoe UI Emoji"/>
+          <w:sz w:val="24"/>
+          <w:szCs w:val="24"/>
+        </w:rPr>
+        <w:t>✅</w:t>
+      </w:r>
+      <w:r>
+        <w:rPr>
+          <w:rFonts w:ascii="Times New Roman" w:hAnsi="Times New Roman" w:cs="Times New Roman"/>
+          <w:sz w:val="24"/>
+          <w:szCs w:val="24"/>
+        </w:rPr>
+        <w:t xml:space="preserve"> Ensures continuous improvements with each iteration.</w:t>
+      </w:r>
+      <w:r>
+        <w:rPr>
+          <w:rFonts w:ascii="Times New Roman" w:hAnsi="Times New Roman" w:cs="Times New Roman"/>
+          <w:sz w:val="24"/>
+          <w:szCs w:val="24"/>
+        </w:rPr>
+        <w:br/>
+      </w:r>
+      <w:r>
+        <w:rPr>
+          <w:rFonts w:ascii="Segoe UI Emoji" w:hAnsi="Segoe UI Emoji" w:cs="Segoe UI Emoji"/>
+          <w:sz w:val="24"/>
+          <w:szCs w:val="24"/>
+        </w:rPr>
+        <w:t>✅</w:t>
+      </w:r>
+      <w:r>
+        <w:rPr>
+          <w:rFonts w:ascii="Times New Roman" w:hAnsi="Times New Roman" w:cs="Times New Roman"/>
+          <w:sz w:val="24"/>
+          <w:szCs w:val="24"/>
+        </w:rPr>
+        <w:t xml:space="preserve"> Supports DevOps culture for automation and CI/CD.</w:t>
+      </w:r>
+    </w:p>
+    <w:p>
+      <w:pPr>
+        <w:rPr>
+          <w:rFonts w:ascii="Times New Roman" w:hAnsi="Times New Roman" w:cs="Times New Roman"/>
+          <w:sz w:val="24"/>
+          <w:szCs w:val="24"/>
+        </w:rPr>
+      </w:pPr>
+      <w:r>
+        <w:rPr>
+          <w:rFonts w:ascii="Segoe UI Emoji" w:hAnsi="Segoe UI Emoji" w:cs="Segoe UI Emoji"/>
+          <w:sz w:val="24"/>
+          <w:szCs w:val="24"/>
+        </w:rPr>
+        <w:t>🔹</w:t>
+      </w:r>
+      <w:r>
+        <w:rPr>
+          <w:rFonts w:ascii="Times New Roman" w:hAnsi="Times New Roman" w:cs="Times New Roman"/>
+          <w:sz w:val="24"/>
+          <w:szCs w:val="24"/>
+        </w:rPr>
+        <w:t xml:space="preserve"> </w:t>
+      </w:r>
+      <w:r>
+        <w:rPr>
+          <w:rFonts w:ascii="Times New Roman" w:hAnsi="Times New Roman" w:cs="Times New Roman"/>
+          <w:b/>
+          <w:bCs/>
+          <w:sz w:val="24"/>
+          <w:szCs w:val="24"/>
+        </w:rPr>
+        <w:t>Example:</w:t>
+      </w:r>
+    </w:p>
+    <w:p>
+      <w:pPr>
+        <w:numPr>
+          <w:ilvl w:val="0"/>
+          <w:numId w:val="37"/>
+        </w:numPr>
+        <w:rPr>
+          <w:rFonts w:ascii="Times New Roman" w:hAnsi="Times New Roman" w:cs="Times New Roman"/>
+          <w:sz w:val="24"/>
+          <w:szCs w:val="24"/>
+        </w:rPr>
+      </w:pPr>
+      <w:r>
+        <w:rPr>
+          <w:rFonts w:ascii="Times New Roman" w:hAnsi="Times New Roman" w:cs="Times New Roman"/>
+          <w:sz w:val="24"/>
+          <w:szCs w:val="24"/>
+        </w:rPr>
+        <w:t>Google Chrome releases updates every 4 weeks instead of once a year.</w:t>
+      </w:r>
+    </w:p>
+    <w:p>
+      <w:pPr>
+        <w:numPr>
+          <w:ilvl w:val="0"/>
+          <w:numId w:val="37"/>
+        </w:numPr>
+        <w:rPr>
+          <w:rFonts w:ascii="Times New Roman" w:hAnsi="Times New Roman" w:cs="Times New Roman"/>
+          <w:sz w:val="24"/>
+          <w:szCs w:val="24"/>
+        </w:rPr>
+      </w:pPr>
+      <w:r>
+        <w:rPr>
+          <w:rFonts w:ascii="Times New Roman" w:hAnsi="Times New Roman" w:cs="Times New Roman"/>
+          <w:sz w:val="24"/>
+          <w:szCs w:val="24"/>
+        </w:rPr>
+        <w:t>Netflix engineers push thousands of code changes daily to improve streaming quality.</w:t>
+      </w:r>
+    </w:p>
+    <w:p>
+      <w:pPr>
+        <w:rPr>
+          <w:rFonts w:ascii="Times New Roman" w:hAnsi="Times New Roman" w:cs="Times New Roman"/>
+          <w:sz w:val="24"/>
+          <w:szCs w:val="24"/>
+        </w:rPr>
+      </w:pPr>
+      <w:r>
+        <w:rPr>
+          <w:rFonts w:ascii="Segoe UI Emoji" w:hAnsi="Segoe UI Emoji" w:cs="Segoe UI Emoji"/>
+          <w:sz w:val="24"/>
+          <w:szCs w:val="24"/>
+        </w:rPr>
+        <w:t>🔹</w:t>
+      </w:r>
+      <w:r>
+        <w:rPr>
+          <w:rFonts w:ascii="Times New Roman" w:hAnsi="Times New Roman" w:cs="Times New Roman"/>
+          <w:sz w:val="24"/>
+          <w:szCs w:val="24"/>
+        </w:rPr>
+        <w:t xml:space="preserve"> </w:t>
+      </w:r>
+      <w:r>
+        <w:rPr>
+          <w:rFonts w:ascii="Times New Roman" w:hAnsi="Times New Roman" w:cs="Times New Roman"/>
+          <w:b/>
+          <w:bCs/>
+          <w:sz w:val="24"/>
+          <w:szCs w:val="24"/>
+        </w:rPr>
+        <w:t>Agile Practice:</w:t>
+      </w:r>
+      <w:r>
+        <w:rPr>
+          <w:rFonts w:ascii="Times New Roman" w:hAnsi="Times New Roman" w:cs="Times New Roman"/>
+          <w:sz w:val="24"/>
+          <w:szCs w:val="24"/>
+        </w:rPr>
+        <w:t xml:space="preserve"> CI/CD Pipelines, automated testing, rapid deployment</w:t>
+      </w:r>
+    </w:p>
+    <w:p>
+      <w:pPr>
+        <w:rPr>
+          <w:rFonts w:ascii="Times New Roman" w:hAnsi="Times New Roman" w:cs="Times New Roman"/>
+          <w:b/>
+          <w:bCs/>
+          <w:sz w:val="24"/>
+          <w:szCs w:val="24"/>
+        </w:rPr>
+      </w:pPr>
+      <w:r>
+        <w:rPr>
+          <w:rFonts w:ascii="Segoe UI Emoji" w:hAnsi="Segoe UI Emoji" w:cs="Segoe UI Emoji"/>
+          <w:b/>
+          <w:bCs/>
+          <w:sz w:val="24"/>
+          <w:szCs w:val="24"/>
+        </w:rPr>
+        <w:t>📌</w:t>
+      </w:r>
+      <w:r>
+        <w:rPr>
+          <w:rFonts w:ascii="Times New Roman" w:hAnsi="Times New Roman" w:cs="Times New Roman"/>
+          <w:b/>
+          <w:bCs/>
+          <w:sz w:val="24"/>
+          <w:szCs w:val="24"/>
+        </w:rPr>
+        <w:t xml:space="preserve"> Summary: Agile vs. Traditional Development</w:t>
+      </w:r>
+    </w:p>
+    <w:tbl>
+      <w:tblPr>
+        <w:tblW w:w="0" w:type="auto"/>
+        <w:tblCellSpacing w:w="15" w:type="dxa"/>
+        <w:tblBorders>
+          <w:top w:val="single" w:sz="4" w:space="0" w:color="auto"/>
+          <w:left w:val="single" w:sz="4" w:space="0" w:color="auto"/>
+          <w:bottom w:val="single" w:sz="4" w:space="0" w:color="auto"/>
+          <w:right w:val="single" w:sz="4" w:space="0" w:color="auto"/>
+          <w:insideH w:val="single" w:sz="4" w:space="0" w:color="auto"/>
+          <w:insideV w:val="single" w:sz="4" w:space="0" w:color="auto"/>
+        </w:tblBorders>
+        <w:tblCellMar>
+          <w:top w:w="15" w:type="dxa"/>
+          <w:left w:w="15" w:type="dxa"/>
+          <w:bottom w:w="15" w:type="dxa"/>
+          <w:right w:w="15" w:type="dxa"/>
+        </w:tblCellMar>
+        <w:tblLook w:val="04A0" w:firstRow="1" w:lastRow="0" w:firstColumn="1" w:lastColumn="0" w:noHBand="0" w:noVBand="1"/>
+      </w:tblPr>
+      <w:tblGrid>
+        <w:gridCol w:w="2444"/>
+        <w:gridCol w:w="2660"/>
+        <w:gridCol w:w="3427"/>
+      </w:tblGrid>
+      <w:tr>
+        <w:trPr>
+          <w:tblHeader/>
+          <w:tblCellSpacing w:w="15" w:type="dxa"/>
+        </w:trPr>
+        <w:tc>
+          <w:tcPr>
+            <w:tcW w:w="0" w:type="auto"/>
+            <w:vAlign w:val="center"/>
+            <w:hideMark/>
+          </w:tcPr>
+          <w:p>
+            <w:pPr>
+              <w:rPr>
+                <w:rFonts w:ascii="Times New Roman" w:hAnsi="Times New Roman" w:cs="Times New Roman"/>
+                <w:b/>
+                <w:bCs/>
+                <w:sz w:val="24"/>
+                <w:szCs w:val="24"/>
+              </w:rPr>
+            </w:pPr>
+            <w:r>
+              <w:rPr>
+                <w:rFonts w:ascii="Times New Roman" w:hAnsi="Times New Roman" w:cs="Times New Roman"/>
+                <w:b/>
+                <w:bCs/>
+                <w:sz w:val="24"/>
+                <w:szCs w:val="24"/>
+              </w:rPr>
+              <w:t>Aspect</w:t>
+            </w:r>
+          </w:p>
+        </w:tc>
+        <w:tc>
+          <w:tcPr>
+            <w:tcW w:w="0" w:type="auto"/>
+            <w:vAlign w:val="center"/>
+            <w:hideMark/>
+          </w:tcPr>
+          <w:p>
+            <w:pPr>
+              <w:rPr>
+                <w:rFonts w:ascii="Times New Roman" w:hAnsi="Times New Roman" w:cs="Times New Roman"/>
+                <w:b/>
+                <w:bCs/>
+                <w:sz w:val="24"/>
+                <w:szCs w:val="24"/>
+              </w:rPr>
+            </w:pPr>
+            <w:r>
+              <w:rPr>
+                <w:rFonts w:ascii="Times New Roman" w:hAnsi="Times New Roman" w:cs="Times New Roman"/>
+                <w:b/>
+                <w:bCs/>
+                <w:sz w:val="24"/>
+                <w:szCs w:val="24"/>
+              </w:rPr>
+              <w:t>Agile</w:t>
+            </w:r>
+          </w:p>
+        </w:tc>
+        <w:tc>
+          <w:tcPr>
+            <w:tcW w:w="0" w:type="auto"/>
+            <w:vAlign w:val="center"/>
+            <w:hideMark/>
+          </w:tcPr>
+          <w:p>
+            <w:pPr>
+              <w:rPr>
+                <w:rFonts w:ascii="Times New Roman" w:hAnsi="Times New Roman" w:cs="Times New Roman"/>
+                <w:b/>
+                <w:bCs/>
+                <w:sz w:val="24"/>
+                <w:szCs w:val="24"/>
+              </w:rPr>
+            </w:pPr>
+            <w:r>
+              <w:rPr>
+                <w:rFonts w:ascii="Times New Roman" w:hAnsi="Times New Roman" w:cs="Times New Roman"/>
+                <w:b/>
+                <w:bCs/>
+                <w:sz w:val="24"/>
+                <w:szCs w:val="24"/>
+              </w:rPr>
+              <w:t>Waterfall</w:t>
+            </w:r>
+          </w:p>
+        </w:tc>
+      </w:tr>
+      <w:tr>
+        <w:trPr>
+          <w:tblCellSpacing w:w="15" w:type="dxa"/>
+        </w:trPr>
+        <w:tc>
+          <w:tcPr>
+            <w:tcW w:w="0" w:type="auto"/>
+            <w:vAlign w:val="center"/>
+            <w:hideMark/>
+          </w:tcPr>
+          <w:p>
+            <w:pPr>
+              <w:rPr>
+                <w:rFonts w:ascii="Times New Roman" w:hAnsi="Times New Roman" w:cs="Times New Roman"/>
+                <w:sz w:val="24"/>
+                <w:szCs w:val="24"/>
+              </w:rPr>
+            </w:pPr>
+            <w:r>
+              <w:rPr>
+                <w:rFonts w:ascii="Times New Roman" w:hAnsi="Times New Roman" w:cs="Times New Roman"/>
+                <w:b/>
+                <w:bCs/>
+                <w:sz w:val="24"/>
+                <w:szCs w:val="24"/>
+              </w:rPr>
+              <w:t>Approach</w:t>
+            </w:r>
+          </w:p>
+        </w:tc>
+        <w:tc>
+          <w:tcPr>
+            <w:tcW w:w="0" w:type="auto"/>
+            <w:vAlign w:val="center"/>
+            <w:hideMark/>
+          </w:tcPr>
+          <w:p>
+            <w:pPr>
+              <w:rPr>
+                <w:rFonts w:ascii="Times New Roman" w:hAnsi="Times New Roman" w:cs="Times New Roman"/>
+                <w:sz w:val="24"/>
+                <w:szCs w:val="24"/>
+              </w:rPr>
+            </w:pPr>
+            <w:r>
+              <w:rPr>
+                <w:rFonts w:ascii="Times New Roman" w:hAnsi="Times New Roman" w:cs="Times New Roman"/>
+                <w:sz w:val="24"/>
+                <w:szCs w:val="24"/>
+              </w:rPr>
+              <w:t>Iterative &amp; flexible</w:t>
+            </w:r>
+          </w:p>
+        </w:tc>
+        <w:tc>
+          <w:tcPr>
+            <w:tcW w:w="0" w:type="auto"/>
+            <w:vAlign w:val="center"/>
+            <w:hideMark/>
+          </w:tcPr>
+          <w:p>
+            <w:pPr>
+              <w:rPr>
+                <w:rFonts w:ascii="Times New Roman" w:hAnsi="Times New Roman" w:cs="Times New Roman"/>
+                <w:sz w:val="24"/>
+                <w:szCs w:val="24"/>
+              </w:rPr>
+            </w:pPr>
+            <w:r>
+              <w:rPr>
+                <w:rFonts w:ascii="Times New Roman" w:hAnsi="Times New Roman" w:cs="Times New Roman"/>
+                <w:sz w:val="24"/>
+                <w:szCs w:val="24"/>
+              </w:rPr>
+              <w:t>Linear &amp; sequential</w:t>
+            </w:r>
+          </w:p>
+        </w:tc>
+      </w:tr>
+      <w:tr>
+        <w:trPr>
+          <w:tblCellSpacing w:w="15" w:type="dxa"/>
+        </w:trPr>
+        <w:tc>
+          <w:tcPr>
+            <w:tcW w:w="0" w:type="auto"/>
+            <w:vAlign w:val="center"/>
+            <w:hideMark/>
+          </w:tcPr>
+          <w:p>
+            <w:pPr>
+              <w:rPr>
+                <w:rFonts w:ascii="Times New Roman" w:hAnsi="Times New Roman" w:cs="Times New Roman"/>
+                <w:sz w:val="24"/>
+                <w:szCs w:val="24"/>
+              </w:rPr>
+            </w:pPr>
+            <w:r>
+              <w:rPr>
+                <w:rFonts w:ascii="Times New Roman" w:hAnsi="Times New Roman" w:cs="Times New Roman"/>
+                <w:b/>
+                <w:bCs/>
+                <w:sz w:val="24"/>
+                <w:szCs w:val="24"/>
+              </w:rPr>
+              <w:t>Customer Involvement</w:t>
+            </w:r>
+          </w:p>
+        </w:tc>
+        <w:tc>
+          <w:tcPr>
+            <w:tcW w:w="0" w:type="auto"/>
+            <w:vAlign w:val="center"/>
+            <w:hideMark/>
+          </w:tcPr>
+          <w:p>
+            <w:pPr>
+              <w:rPr>
+                <w:rFonts w:ascii="Times New Roman" w:hAnsi="Times New Roman" w:cs="Times New Roman"/>
+                <w:sz w:val="24"/>
+                <w:szCs w:val="24"/>
+              </w:rPr>
+            </w:pPr>
+            <w:r>
+              <w:rPr>
+                <w:rFonts w:ascii="Times New Roman" w:hAnsi="Times New Roman" w:cs="Times New Roman"/>
+                <w:sz w:val="24"/>
+                <w:szCs w:val="24"/>
+              </w:rPr>
+              <w:t>High, continuous feedback</w:t>
+            </w:r>
+          </w:p>
+        </w:tc>
+        <w:tc>
+          <w:tcPr>
+            <w:tcW w:w="0" w:type="auto"/>
+            <w:vAlign w:val="center"/>
+            <w:hideMark/>
+          </w:tcPr>
+          <w:p>
+            <w:pPr>
+              <w:rPr>
+                <w:rFonts w:ascii="Times New Roman" w:hAnsi="Times New Roman" w:cs="Times New Roman"/>
+                <w:sz w:val="24"/>
+                <w:szCs w:val="24"/>
+              </w:rPr>
+            </w:pPr>
+            <w:r>
+              <w:rPr>
+                <w:rFonts w:ascii="Times New Roman" w:hAnsi="Times New Roman" w:cs="Times New Roman"/>
+                <w:sz w:val="24"/>
+                <w:szCs w:val="24"/>
+              </w:rPr>
+              <w:t>Low, only at the start &amp; end</w:t>
+            </w:r>
+          </w:p>
+        </w:tc>
+      </w:tr>
+      <w:tr>
+        <w:trPr>
+          <w:tblCellSpacing w:w="15" w:type="dxa"/>
+        </w:trPr>
+        <w:tc>
+          <w:tcPr>
+            <w:tcW w:w="0" w:type="auto"/>
+            <w:vAlign w:val="center"/>
+            <w:hideMark/>
+          </w:tcPr>
+          <w:p>
+            <w:pPr>
+              <w:rPr>
+                <w:rFonts w:ascii="Times New Roman" w:hAnsi="Times New Roman" w:cs="Times New Roman"/>
+                <w:sz w:val="24"/>
+                <w:szCs w:val="24"/>
+              </w:rPr>
+            </w:pPr>
+            <w:r>
+              <w:rPr>
+                <w:rFonts w:ascii="Times New Roman" w:hAnsi="Times New Roman" w:cs="Times New Roman"/>
+                <w:b/>
+                <w:bCs/>
+                <w:sz w:val="24"/>
+                <w:szCs w:val="24"/>
+              </w:rPr>
+              <w:t>Adaptability</w:t>
+            </w:r>
+          </w:p>
+        </w:tc>
+        <w:tc>
+          <w:tcPr>
+            <w:tcW w:w="0" w:type="auto"/>
+            <w:vAlign w:val="center"/>
+            <w:hideMark/>
+          </w:tcPr>
+          <w:p>
+            <w:pPr>
+              <w:rPr>
+                <w:rFonts w:ascii="Times New Roman" w:hAnsi="Times New Roman" w:cs="Times New Roman"/>
+                <w:sz w:val="24"/>
+                <w:szCs w:val="24"/>
+              </w:rPr>
+            </w:pPr>
+            <w:r>
+              <w:rPr>
+                <w:rFonts w:ascii="Times New Roman" w:hAnsi="Times New Roman" w:cs="Times New Roman"/>
+                <w:sz w:val="24"/>
+                <w:szCs w:val="24"/>
+              </w:rPr>
+              <w:t>High, can pivot anytime</w:t>
+            </w:r>
+          </w:p>
+        </w:tc>
+        <w:tc>
+          <w:tcPr>
+            <w:tcW w:w="0" w:type="auto"/>
+            <w:vAlign w:val="center"/>
+            <w:hideMark/>
+          </w:tcPr>
+          <w:p>
+            <w:pPr>
+              <w:rPr>
+                <w:rFonts w:ascii="Times New Roman" w:hAnsi="Times New Roman" w:cs="Times New Roman"/>
+                <w:sz w:val="24"/>
+                <w:szCs w:val="24"/>
+              </w:rPr>
+            </w:pPr>
+            <w:r>
+              <w:rPr>
+                <w:rFonts w:ascii="Times New Roman" w:hAnsi="Times New Roman" w:cs="Times New Roman"/>
+                <w:sz w:val="24"/>
+                <w:szCs w:val="24"/>
+              </w:rPr>
+              <w:t>Low, changes are expensive</w:t>
+            </w:r>
+          </w:p>
+        </w:tc>
+      </w:tr>
+      <w:tr>
+        <w:trPr>
+          <w:tblCellSpacing w:w="15" w:type="dxa"/>
+        </w:trPr>
+        <w:tc>
+          <w:tcPr>
+            <w:tcW w:w="0" w:type="auto"/>
+            <w:vAlign w:val="center"/>
+            <w:hideMark/>
+          </w:tcPr>
+          <w:p>
+            <w:pPr>
+              <w:rPr>
+                <w:rFonts w:ascii="Times New Roman" w:hAnsi="Times New Roman" w:cs="Times New Roman"/>
+                <w:sz w:val="24"/>
+                <w:szCs w:val="24"/>
+              </w:rPr>
+            </w:pPr>
+            <w:r>
+              <w:rPr>
+                <w:rFonts w:ascii="Times New Roman" w:hAnsi="Times New Roman" w:cs="Times New Roman"/>
+                <w:b/>
+                <w:bCs/>
+                <w:sz w:val="24"/>
+                <w:szCs w:val="24"/>
+              </w:rPr>
+              <w:t>Delivery Speed</w:t>
+            </w:r>
+          </w:p>
+        </w:tc>
+        <w:tc>
+          <w:tcPr>
+            <w:tcW w:w="0" w:type="auto"/>
+            <w:vAlign w:val="center"/>
+            <w:hideMark/>
+          </w:tcPr>
+          <w:p>
+            <w:pPr>
+              <w:rPr>
+                <w:rFonts w:ascii="Times New Roman" w:hAnsi="Times New Roman" w:cs="Times New Roman"/>
+                <w:sz w:val="24"/>
+                <w:szCs w:val="24"/>
+              </w:rPr>
+            </w:pPr>
+            <w:r>
+              <w:rPr>
+                <w:rFonts w:ascii="Times New Roman" w:hAnsi="Times New Roman" w:cs="Times New Roman"/>
+                <w:sz w:val="24"/>
+                <w:szCs w:val="24"/>
+              </w:rPr>
+              <w:t>Frequent small releases</w:t>
+            </w:r>
+          </w:p>
+        </w:tc>
+        <w:tc>
+          <w:tcPr>
+            <w:tcW w:w="0" w:type="auto"/>
+            <w:vAlign w:val="center"/>
+            <w:hideMark/>
+          </w:tcPr>
+          <w:p>
+            <w:pPr>
+              <w:rPr>
+                <w:rFonts w:ascii="Times New Roman" w:hAnsi="Times New Roman" w:cs="Times New Roman"/>
+                <w:sz w:val="24"/>
+                <w:szCs w:val="24"/>
+              </w:rPr>
+            </w:pPr>
+            <w:r>
+              <w:rPr>
+                <w:rFonts w:ascii="Times New Roman" w:hAnsi="Times New Roman" w:cs="Times New Roman"/>
+                <w:sz w:val="24"/>
+                <w:szCs w:val="24"/>
+              </w:rPr>
+              <w:t>One big release after months/years</w:t>
+            </w:r>
+          </w:p>
+        </w:tc>
+      </w:tr>
+    </w:tbl>
+    <w:p>
+      <w:pPr>
+        <w:rPr>
+          <w:rFonts w:ascii="Times New Roman" w:hAnsi="Times New Roman" w:cs="Times New Roman"/>
+          <w:sz w:val="24"/>
+          <w:szCs w:val="24"/>
+        </w:rPr>
+      </w:pPr>
+      <w:r>
+        <w:rPr>
+          <w:rFonts w:ascii="Segoe UI Emoji" w:hAnsi="Segoe UI Emoji" w:cs="Segoe UI Emoji"/>
+          <w:sz w:val="24"/>
+          <w:szCs w:val="24"/>
+        </w:rPr>
+        <w:t>💡</w:t>
+      </w:r>
+      <w:r>
+        <w:rPr>
+          <w:rFonts w:ascii="Times New Roman" w:hAnsi="Times New Roman" w:cs="Times New Roman"/>
+          <w:sz w:val="24"/>
+          <w:szCs w:val="24"/>
+        </w:rPr>
+        <w:t xml:space="preserve"> </w:t>
+      </w:r>
+      <w:r>
+        <w:rPr>
+          <w:rFonts w:ascii="Times New Roman" w:hAnsi="Times New Roman" w:cs="Times New Roman"/>
+          <w:b/>
+          <w:bCs/>
+          <w:sz w:val="24"/>
+          <w:szCs w:val="24"/>
+        </w:rPr>
+        <w:t>DevOps complements Agile</w:t>
+      </w:r>
+      <w:r>
+        <w:rPr>
+          <w:rFonts w:ascii="Times New Roman" w:hAnsi="Times New Roman" w:cs="Times New Roman"/>
+          <w:sz w:val="24"/>
+          <w:szCs w:val="24"/>
+        </w:rPr>
+        <w:t xml:space="preserve"> by automating the </w:t>
+      </w:r>
+      <w:r>
+        <w:rPr>
+          <w:rFonts w:ascii="Times New Roman" w:hAnsi="Times New Roman" w:cs="Times New Roman"/>
+          <w:b/>
+          <w:bCs/>
+          <w:sz w:val="24"/>
+          <w:szCs w:val="24"/>
+        </w:rPr>
+        <w:t>build, test, and deployment process</w:t>
+      </w:r>
+      <w:r>
+        <w:rPr>
+          <w:rFonts w:ascii="Times New Roman" w:hAnsi="Times New Roman" w:cs="Times New Roman"/>
+          <w:sz w:val="24"/>
+          <w:szCs w:val="24"/>
+        </w:rPr>
+        <w:t>, enabling even</w:t>
+      </w:r>
+      <w:r>
+        <w:rPr>
+          <w:rFonts w:ascii="Times New Roman" w:hAnsi="Times New Roman" w:cs="Times New Roman"/>
+          <w:sz w:val="24"/>
+          <w:szCs w:val="24"/>
+        </w:rPr>
+        <w:t xml:space="preserve"> </w:t>
+      </w:r>
+      <w:r>
+        <w:rPr>
+          <w:rFonts w:ascii="Times New Roman" w:hAnsi="Times New Roman" w:cs="Times New Roman"/>
+          <w:sz w:val="24"/>
+          <w:szCs w:val="24"/>
+        </w:rPr>
+        <w:t>faster and more reliable releases.</w:t>
+      </w:r>
+    </w:p>
+    <w:p>
+      <w:pPr>
+        <w:shd w:val="clear" w:color="auto" w:fill="FFE599" w:themeFill="accent4" w:themeFillTint="66"/>
+        <w:rPr>
+          <w:rFonts w:ascii="Times New Roman" w:hAnsi="Times New Roman" w:cs="Times New Roman"/>
+          <w:b/>
+          <w:bCs/>
+          <w:sz w:val="24"/>
+          <w:szCs w:val="24"/>
+        </w:rPr>
+      </w:pPr>
+      <w:r>
+        <w:rPr>
+          <w:rFonts w:ascii="Times New Roman" w:hAnsi="Times New Roman" w:cs="Times New Roman"/>
+          <w:b/>
+          <w:bCs/>
+          <w:sz w:val="24"/>
+          <w:szCs w:val="24"/>
+        </w:rPr>
+        <w:t>2. IT Operations Challenges Before DevOps</w:t>
+      </w:r>
+    </w:p>
+    <w:p>
+      <w:pPr>
+        <w:rPr>
+          <w:rFonts w:ascii="Times New Roman" w:hAnsi="Times New Roman" w:cs="Times New Roman"/>
+          <w:sz w:val="24"/>
+          <w:szCs w:val="24"/>
+        </w:rPr>
+      </w:pPr>
+      <w:r>
+        <w:rPr>
+          <w:rFonts w:ascii="Times New Roman" w:hAnsi="Times New Roman" w:cs="Times New Roman"/>
+          <w:sz w:val="24"/>
+          <w:szCs w:val="24"/>
+        </w:rPr>
+        <w:t xml:space="preserve">Even with Agile, </w:t>
+      </w:r>
+      <w:r>
+        <w:rPr>
+          <w:rFonts w:ascii="Times New Roman" w:hAnsi="Times New Roman" w:cs="Times New Roman"/>
+          <w:b/>
+          <w:bCs/>
+          <w:sz w:val="24"/>
+          <w:szCs w:val="24"/>
+        </w:rPr>
+        <w:t>IT operations still struggled</w:t>
+      </w:r>
+      <w:r>
+        <w:rPr>
+          <w:rFonts w:ascii="Times New Roman" w:hAnsi="Times New Roman" w:cs="Times New Roman"/>
+          <w:sz w:val="24"/>
+          <w:szCs w:val="24"/>
+        </w:rPr>
+        <w:t xml:space="preserve"> due to:</w:t>
+      </w:r>
+    </w:p>
+    <w:p>
+      <w:pPr>
+        <w:rPr>
+          <w:rFonts w:ascii="Times New Roman" w:hAnsi="Times New Roman" w:cs="Times New Roman"/>
+          <w:sz w:val="24"/>
+          <w:szCs w:val="24"/>
+        </w:rPr>
+      </w:pPr>
+      <w:r>
+        <w:rPr>
+          <w:rFonts w:ascii="Segoe UI Emoji" w:hAnsi="Segoe UI Emoji" w:cs="Segoe UI Emoji"/>
+          <w:sz w:val="24"/>
+          <w:szCs w:val="24"/>
+        </w:rPr>
+        <w:t>🚫</w:t>
+      </w:r>
+      <w:r>
+        <w:rPr>
+          <w:rFonts w:ascii="Times New Roman" w:hAnsi="Times New Roman" w:cs="Times New Roman"/>
+          <w:sz w:val="24"/>
+          <w:szCs w:val="24"/>
+        </w:rPr>
+        <w:t xml:space="preserve"> Slow deployment cycles – Manual infrastructure setup delayed releases.</w:t>
+      </w:r>
+      <w:r>
+        <w:rPr>
+          <w:rFonts w:ascii="Times New Roman" w:hAnsi="Times New Roman" w:cs="Times New Roman"/>
+          <w:sz w:val="24"/>
+          <w:szCs w:val="24"/>
+        </w:rPr>
+        <w:br/>
+      </w:r>
+      <w:r>
+        <w:rPr>
+          <w:rFonts w:ascii="Segoe UI Emoji" w:hAnsi="Segoe UI Emoji" w:cs="Segoe UI Emoji"/>
+          <w:sz w:val="24"/>
+          <w:szCs w:val="24"/>
+        </w:rPr>
+        <w:t>🚫</w:t>
+      </w:r>
+      <w:r>
+        <w:rPr>
+          <w:rFonts w:ascii="Times New Roman" w:hAnsi="Times New Roman" w:cs="Times New Roman"/>
+          <w:sz w:val="24"/>
+          <w:szCs w:val="24"/>
+        </w:rPr>
+        <w:t xml:space="preserve"> Siloed teams – Devs built software, but Ops struggled to deploy it efficiently.</w:t>
+      </w:r>
+      <w:r>
+        <w:rPr>
+          <w:rFonts w:ascii="Times New Roman" w:hAnsi="Times New Roman" w:cs="Times New Roman"/>
+          <w:sz w:val="24"/>
+          <w:szCs w:val="24"/>
+        </w:rPr>
+        <w:br/>
+      </w:r>
+      <w:r>
+        <w:rPr>
+          <w:rFonts w:ascii="Segoe UI Emoji" w:hAnsi="Segoe UI Emoji" w:cs="Segoe UI Emoji"/>
+          <w:sz w:val="24"/>
+          <w:szCs w:val="24"/>
+        </w:rPr>
+        <w:t>🚫</w:t>
+      </w:r>
+      <w:r>
+        <w:rPr>
+          <w:rFonts w:ascii="Times New Roman" w:hAnsi="Times New Roman" w:cs="Times New Roman"/>
+          <w:sz w:val="24"/>
+          <w:szCs w:val="24"/>
+        </w:rPr>
+        <w:t xml:space="preserve"> Lack of automation – Configuration and testing required manual effort.</w:t>
+      </w:r>
+    </w:p>
+    <w:p>
+      <w:pPr>
+        <w:rPr>
+          <w:rFonts w:ascii="Times New Roman" w:hAnsi="Times New Roman" w:cs="Times New Roman"/>
+          <w:sz w:val="24"/>
+          <w:szCs w:val="24"/>
+        </w:rPr>
+      </w:pPr>
+      <w:r>
+        <w:rPr>
+          <w:rFonts w:ascii="Segoe UI Emoji" w:hAnsi="Segoe UI Emoji" w:cs="Segoe UI Emoji"/>
+          <w:sz w:val="24"/>
+          <w:szCs w:val="24"/>
+        </w:rPr>
+        <w:t>🔹</w:t>
+      </w:r>
+      <w:r>
+        <w:rPr>
+          <w:rFonts w:ascii="Times New Roman" w:hAnsi="Times New Roman" w:cs="Times New Roman"/>
+          <w:sz w:val="24"/>
+          <w:szCs w:val="24"/>
+        </w:rPr>
+        <w:t xml:space="preserve"> </w:t>
+      </w:r>
+      <w:r>
+        <w:rPr>
+          <w:rFonts w:ascii="Times New Roman" w:hAnsi="Times New Roman" w:cs="Times New Roman"/>
+          <w:b/>
+          <w:bCs/>
+          <w:sz w:val="24"/>
+          <w:szCs w:val="24"/>
+        </w:rPr>
+        <w:t>Example:</w:t>
+      </w:r>
+      <w:r>
+        <w:rPr>
+          <w:rFonts w:ascii="Times New Roman" w:hAnsi="Times New Roman" w:cs="Times New Roman"/>
+          <w:sz w:val="24"/>
+          <w:szCs w:val="24"/>
+        </w:rPr>
+        <w:br/>
+        <w:t>A video streaming company using Agile could build features quickly, but deployments took weeks due to manual infrastructure provisioning.</w:t>
+      </w:r>
+    </w:p>
+    <w:p>
+      <w:pPr>
+        <w:shd w:val="clear" w:color="auto" w:fill="FFE599" w:themeFill="accent4" w:themeFillTint="66"/>
+        <w:rPr>
+          <w:rFonts w:ascii="Times New Roman" w:hAnsi="Times New Roman" w:cs="Times New Roman"/>
+          <w:b/>
+          <w:bCs/>
+          <w:sz w:val="24"/>
+          <w:szCs w:val="24"/>
+        </w:rPr>
+      </w:pPr>
+      <w:r>
+        <w:rPr>
+          <w:rFonts w:ascii="Times New Roman" w:hAnsi="Times New Roman" w:cs="Times New Roman"/>
+          <w:b/>
+          <w:bCs/>
+          <w:sz w:val="24"/>
+          <w:szCs w:val="24"/>
+        </w:rPr>
+        <w:t xml:space="preserve">3. The Rise of DevOps (2010s - Present) </w:t>
+      </w:r>
+      <w:r>
+        <w:rPr>
+          <w:rFonts w:ascii="Segoe UI Emoji" w:hAnsi="Segoe UI Emoji" w:cs="Segoe UI Emoji"/>
+          <w:b/>
+          <w:bCs/>
+          <w:sz w:val="24"/>
+          <w:szCs w:val="24"/>
+        </w:rPr>
+        <w:t>🚀</w:t>
+      </w:r>
+    </w:p>
+    <w:p>
+      <w:pPr>
+        <w:rPr>
+          <w:rFonts w:ascii="Times New Roman" w:hAnsi="Times New Roman" w:cs="Times New Roman"/>
+          <w:sz w:val="24"/>
+          <w:szCs w:val="24"/>
+        </w:rPr>
+      </w:pPr>
+      <w:r>
+        <w:rPr>
+          <w:rFonts w:ascii="Segoe UI Emoji" w:hAnsi="Segoe UI Emoji" w:cs="Segoe UI Emoji"/>
+          <w:sz w:val="24"/>
+          <w:szCs w:val="24"/>
+        </w:rPr>
+        <w:t>✅</w:t>
+      </w:r>
+      <w:r>
+        <w:rPr>
+          <w:rFonts w:ascii="Times New Roman" w:hAnsi="Times New Roman" w:cs="Times New Roman"/>
+          <w:sz w:val="24"/>
+          <w:szCs w:val="24"/>
+        </w:rPr>
+        <w:t xml:space="preserve"> DevOps bridges the gap between Development (Dev) and IT Operations (Ops).</w:t>
+      </w:r>
+      <w:r>
+        <w:rPr>
+          <w:rFonts w:ascii="Times New Roman" w:hAnsi="Times New Roman" w:cs="Times New Roman"/>
+          <w:sz w:val="24"/>
+          <w:szCs w:val="24"/>
+        </w:rPr>
+        <w:br/>
+      </w:r>
+      <w:r>
+        <w:rPr>
+          <w:rFonts w:ascii="Segoe UI Emoji" w:hAnsi="Segoe UI Emoji" w:cs="Segoe UI Emoji"/>
+          <w:sz w:val="24"/>
+          <w:szCs w:val="24"/>
+        </w:rPr>
+        <w:t>✅</w:t>
+      </w:r>
+      <w:r>
+        <w:rPr>
+          <w:rFonts w:ascii="Times New Roman" w:hAnsi="Times New Roman" w:cs="Times New Roman"/>
+          <w:sz w:val="24"/>
+          <w:szCs w:val="24"/>
+        </w:rPr>
+        <w:t xml:space="preserve"> Introduces automation, CI/CD pipelines, and Infrastructure as Code (IaC).</w:t>
+      </w:r>
+      <w:r>
+        <w:rPr>
+          <w:rFonts w:ascii="Times New Roman" w:hAnsi="Times New Roman" w:cs="Times New Roman"/>
+          <w:sz w:val="24"/>
+          <w:szCs w:val="24"/>
+        </w:rPr>
+        <w:br/>
+      </w:r>
+      <w:r>
+        <w:rPr>
+          <w:rFonts w:ascii="Segoe UI Emoji" w:hAnsi="Segoe UI Emoji" w:cs="Segoe UI Emoji"/>
+          <w:sz w:val="24"/>
+          <w:szCs w:val="24"/>
+        </w:rPr>
+        <w:t>✅</w:t>
+      </w:r>
+      <w:r>
+        <w:rPr>
+          <w:rFonts w:ascii="Times New Roman" w:hAnsi="Times New Roman" w:cs="Times New Roman"/>
+          <w:sz w:val="24"/>
+          <w:szCs w:val="24"/>
+        </w:rPr>
+        <w:t xml:space="preserve"> Enables faster releases, improved collaboration, and reliability.</w:t>
+      </w:r>
+    </w:p>
+    <w:p>
+      <w:pPr>
+        <w:rPr>
+          <w:rFonts w:ascii="Times New Roman" w:hAnsi="Times New Roman" w:cs="Times New Roman"/>
+          <w:sz w:val="24"/>
+          <w:szCs w:val="24"/>
+        </w:rPr>
+      </w:pPr>
+      <w:r>
+        <w:rPr>
+          <w:rFonts w:ascii="Segoe UI Emoji" w:hAnsi="Segoe UI Emoji" w:cs="Segoe UI Emoji"/>
+          <w:sz w:val="24"/>
+          <w:szCs w:val="24"/>
+        </w:rPr>
+        <w:t>🔹</w:t>
+      </w:r>
+      <w:r>
+        <w:rPr>
+          <w:rFonts w:ascii="Times New Roman" w:hAnsi="Times New Roman" w:cs="Times New Roman"/>
+          <w:sz w:val="24"/>
+          <w:szCs w:val="24"/>
+        </w:rPr>
+        <w:t xml:space="preserve"> </w:t>
+      </w:r>
+      <w:r>
+        <w:rPr>
+          <w:rFonts w:ascii="Times New Roman" w:hAnsi="Times New Roman" w:cs="Times New Roman"/>
+          <w:b/>
+          <w:bCs/>
+          <w:sz w:val="24"/>
+          <w:szCs w:val="24"/>
+        </w:rPr>
         <w:t>Key Innovations in DevOps:</w:t>
       </w:r>
       <w:r>
@@ -6217,25 +7445,7 @@
           <w:sz w:val="24"/>
           <w:szCs w:val="24"/>
         </w:rPr>
-        <w:t>Infrastructure as Code (</w:t>
-      </w:r>
-      <w:proofErr w:type="spellStart"/>
-      <w:r>
-        <w:rPr>
-          <w:rFonts w:ascii="Times New Roman" w:hAnsi="Times New Roman" w:cs="Times New Roman"/>
-          <w:sz w:val="24"/>
-          <w:szCs w:val="24"/>
-        </w:rPr>
-        <w:t>IaC</w:t>
-      </w:r>
-      <w:proofErr w:type="spellEnd"/>
-      <w:r>
-        <w:rPr>
-          <w:rFonts w:ascii="Times New Roman" w:hAnsi="Times New Roman" w:cs="Times New Roman"/>
-          <w:sz w:val="24"/>
-          <w:szCs w:val="24"/>
-        </w:rPr>
-        <w:t>) – Automate cloud infrastructure setup.</w:t>
+        <w:t>Infrastructure as Code (IaC) – Automate cloud infrastructure setup.</w:t>
       </w:r>
       <w:r>
         <w:rPr>
@@ -6248,7 +7458,7 @@
       </w:r>
       <w:r>
         <w:rPr>
-          <w:rFonts w:ascii="Segoe UI Symbol" w:hAnsi="Segoe UI Symbol" w:cs="Segoe UI Symbol"/>
+          <w:rFonts w:ascii="Times New Roman" w:hAnsi="Times New Roman" w:cs="Times New Roman"/>
           <w:sz w:val="24"/>
           <w:szCs w:val="24"/>
         </w:rPr>
@@ -6828,25 +8038,7 @@
           <w:sz w:val="24"/>
           <w:szCs w:val="24"/>
         </w:rPr>
-        <w:t xml:space="preserve"> The term "DevOps" was introduced at the </w:t>
-      </w:r>
-      <w:proofErr w:type="spellStart"/>
-      <w:r>
-        <w:rPr>
-          <w:rFonts w:ascii="Times New Roman" w:hAnsi="Times New Roman" w:cs="Times New Roman"/>
-          <w:sz w:val="24"/>
-          <w:szCs w:val="24"/>
-        </w:rPr>
-        <w:t>DevOpsDays</w:t>
-      </w:r>
-      <w:proofErr w:type="spellEnd"/>
-      <w:r>
-        <w:rPr>
-          <w:rFonts w:ascii="Times New Roman" w:hAnsi="Times New Roman" w:cs="Times New Roman"/>
-          <w:sz w:val="24"/>
-          <w:szCs w:val="24"/>
-        </w:rPr>
-        <w:t xml:space="preserve"> Conference by Patrick Debois, a Belgian IT consultant.</w:t>
+        <w:t xml:space="preserve"> The term "DevOps" was introduced at the DevOpsDays Conference by Patrick Debois, a Belgian IT consultant.</w:t>
       </w:r>
       <w:r>
         <w:rPr>
@@ -6948,47 +8140,7 @@
           <w:sz w:val="24"/>
           <w:szCs w:val="24"/>
         </w:rPr>
-        <w:t>1</w:t>
-      </w:r>
-      <w:r>
-        <w:rPr>
-          <w:rFonts w:ascii="Times New Roman" w:hAnsi="Times New Roman" w:cs="Times New Roman"/>
-          <w:b/>
-          <w:bCs/>
-          <w:sz w:val="24"/>
-          <w:szCs w:val="24"/>
-        </w:rPr>
-        <w:t>️</w:t>
-      </w:r>
-      <w:r>
-        <w:rPr>
-          <w:rFonts w:ascii="Segoe UI Symbol" w:hAnsi="Segoe UI Symbol" w:cs="Segoe UI Symbol"/>
-          <w:b/>
-          <w:bCs/>
-          <w:sz w:val="24"/>
-          <w:szCs w:val="24"/>
-        </w:rPr>
-        <w:t>.</w:t>
-      </w:r>
-      <w:r>
-        <w:rPr>
-          <w:rFonts w:ascii="Times New Roman" w:hAnsi="Times New Roman" w:cs="Times New Roman"/>
-          <w:b/>
-          <w:bCs/>
-          <w:sz w:val="24"/>
-          <w:szCs w:val="24"/>
-        </w:rPr>
-        <w:t xml:space="preserve"> Rise</w:t>
-      </w:r>
-      <w:r>
-        <w:rPr>
-          <w:rFonts w:ascii="Times New Roman" w:hAnsi="Times New Roman" w:cs="Times New Roman"/>
-          <w:b/>
-          <w:bCs/>
-          <w:sz w:val="24"/>
-          <w:szCs w:val="24"/>
-        </w:rPr>
-        <w:t xml:space="preserve"> of Cloud Computing </w:t>
+        <w:t xml:space="preserve">1️. Rise of Cloud Computing </w:t>
       </w:r>
       <w:r>
         <w:rPr>
@@ -7268,47 +8420,7 @@
           <w:sz w:val="24"/>
           <w:szCs w:val="24"/>
         </w:rPr>
-        <w:t>2</w:t>
-      </w:r>
-      <w:r>
-        <w:rPr>
-          <w:rFonts w:ascii="Times New Roman" w:hAnsi="Times New Roman" w:cs="Times New Roman"/>
-          <w:b/>
-          <w:bCs/>
-          <w:sz w:val="24"/>
-          <w:szCs w:val="24"/>
-        </w:rPr>
-        <w:t>️</w:t>
-      </w:r>
-      <w:r>
-        <w:rPr>
-          <w:rFonts w:ascii="Segoe UI Symbol" w:hAnsi="Segoe UI Symbol" w:cs="Segoe UI Symbol"/>
-          <w:b/>
-          <w:bCs/>
-          <w:sz w:val="24"/>
-          <w:szCs w:val="24"/>
-        </w:rPr>
-        <w:t>.</w:t>
-      </w:r>
-      <w:r>
-        <w:rPr>
-          <w:rFonts w:ascii="Times New Roman" w:hAnsi="Times New Roman" w:cs="Times New Roman"/>
-          <w:b/>
-          <w:bCs/>
-          <w:sz w:val="24"/>
-          <w:szCs w:val="24"/>
-        </w:rPr>
-        <w:t xml:space="preserve"> The</w:t>
-      </w:r>
-      <w:r>
-        <w:rPr>
-          <w:rFonts w:ascii="Times New Roman" w:hAnsi="Times New Roman" w:cs="Times New Roman"/>
-          <w:b/>
-          <w:bCs/>
-          <w:sz w:val="24"/>
-          <w:szCs w:val="24"/>
-        </w:rPr>
-        <w:t xml:space="preserve"> Need for Faster Software Delivery </w:t>
+        <w:t xml:space="preserve">2️. The Need for Faster Software Delivery </w:t>
       </w:r>
       <w:r>
         <w:rPr>
@@ -7546,47 +8658,7 @@
           <w:sz w:val="24"/>
           <w:szCs w:val="24"/>
         </w:rPr>
-        <w:t>3</w:t>
-      </w:r>
-      <w:r>
-        <w:rPr>
-          <w:rFonts w:ascii="Times New Roman" w:hAnsi="Times New Roman" w:cs="Times New Roman"/>
-          <w:b/>
-          <w:bCs/>
-          <w:sz w:val="24"/>
-          <w:szCs w:val="24"/>
-        </w:rPr>
-        <w:t>️</w:t>
-      </w:r>
-      <w:r>
-        <w:rPr>
-          <w:rFonts w:ascii="Segoe UI Symbol" w:hAnsi="Segoe UI Symbol" w:cs="Segoe UI Symbol"/>
-          <w:b/>
-          <w:bCs/>
-          <w:sz w:val="24"/>
-          <w:szCs w:val="24"/>
-        </w:rPr>
-        <w:t>.</w:t>
-      </w:r>
-      <w:r>
-        <w:rPr>
-          <w:rFonts w:ascii="Times New Roman" w:hAnsi="Times New Roman" w:cs="Times New Roman"/>
-          <w:b/>
-          <w:bCs/>
-          <w:sz w:val="24"/>
-          <w:szCs w:val="24"/>
-        </w:rPr>
-        <w:t xml:space="preserve"> Increasing</w:t>
-      </w:r>
-      <w:r>
-        <w:rPr>
-          <w:rFonts w:ascii="Times New Roman" w:hAnsi="Times New Roman" w:cs="Times New Roman"/>
-          <w:b/>
-          <w:bCs/>
-          <w:sz w:val="24"/>
-          <w:szCs w:val="24"/>
-        </w:rPr>
-        <w:t xml:space="preserve"> Complexity in IT Infrastructure </w:t>
+        <w:t xml:space="preserve">3️. Increasing Complexity in IT Infrastructure </w:t>
       </w:r>
       <w:r>
         <w:rPr>
@@ -7621,25 +8693,7 @@
           <w:sz w:val="24"/>
           <w:szCs w:val="24"/>
         </w:rPr>
-        <w:t xml:space="preserve"> Traditional data </w:t>
-      </w:r>
-      <w:proofErr w:type="spellStart"/>
-      <w:r>
-        <w:rPr>
-          <w:rFonts w:ascii="Times New Roman" w:hAnsi="Times New Roman" w:cs="Times New Roman"/>
-          <w:sz w:val="24"/>
-          <w:szCs w:val="24"/>
-        </w:rPr>
-        <w:t>centers</w:t>
-      </w:r>
-      <w:proofErr w:type="spellEnd"/>
-      <w:r>
-        <w:rPr>
-          <w:rFonts w:ascii="Times New Roman" w:hAnsi="Times New Roman" w:cs="Times New Roman"/>
-          <w:sz w:val="24"/>
-          <w:szCs w:val="24"/>
-        </w:rPr>
-        <w:t xml:space="preserve"> required manual configuration.</w:t>
+        <w:t xml:space="preserve"> Traditional data centers required manual configuration.</w:t>
       </w:r>
       <w:r>
         <w:rPr>
@@ -7687,25 +8741,7 @@
           <w:sz w:val="24"/>
           <w:szCs w:val="24"/>
         </w:rPr>
-        <w:t xml:space="preserve"> Infrastructure needed to be managed as code (Infrastructure as Code - </w:t>
-      </w:r>
-      <w:proofErr w:type="spellStart"/>
-      <w:r>
-        <w:rPr>
-          <w:rFonts w:ascii="Times New Roman" w:hAnsi="Times New Roman" w:cs="Times New Roman"/>
-          <w:sz w:val="24"/>
-          <w:szCs w:val="24"/>
-        </w:rPr>
-        <w:t>IaC</w:t>
-      </w:r>
-      <w:proofErr w:type="spellEnd"/>
-      <w:r>
-        <w:rPr>
-          <w:rFonts w:ascii="Times New Roman" w:hAnsi="Times New Roman" w:cs="Times New Roman"/>
-          <w:sz w:val="24"/>
-          <w:szCs w:val="24"/>
-        </w:rPr>
-        <w:t>).</w:t>
+        <w:t xml:space="preserve"> Infrastructure needed to be managed as code (Infrastructure as Code - IaC).</w:t>
       </w:r>
     </w:p>
     <w:p>
@@ -7838,25 +8874,7 @@
           <w:sz w:val="24"/>
           <w:szCs w:val="24"/>
         </w:rPr>
-        <w:t>Infrastructure as Code (</w:t>
-      </w:r>
-      <w:proofErr w:type="spellStart"/>
-      <w:r>
-        <w:rPr>
-          <w:rFonts w:ascii="Times New Roman" w:hAnsi="Times New Roman" w:cs="Times New Roman"/>
-          <w:sz w:val="24"/>
-          <w:szCs w:val="24"/>
-        </w:rPr>
-        <w:t>IaC</w:t>
-      </w:r>
-      <w:proofErr w:type="spellEnd"/>
-      <w:r>
-        <w:rPr>
-          <w:rFonts w:ascii="Times New Roman" w:hAnsi="Times New Roman" w:cs="Times New Roman"/>
-          <w:sz w:val="24"/>
-          <w:szCs w:val="24"/>
-        </w:rPr>
-        <w:t>) with Terraform &amp; Ansible.</w:t>
+        <w:t>Infrastructure as Code (IaC) with Terraform &amp; Ansible.</w:t>
       </w:r>
     </w:p>
     <w:p>
@@ -7878,47 +8896,7 @@
           <w:sz w:val="24"/>
           <w:szCs w:val="24"/>
         </w:rPr>
-        <w:t>4</w:t>
-      </w:r>
-      <w:r>
-        <w:rPr>
-          <w:rFonts w:ascii="Times New Roman" w:hAnsi="Times New Roman" w:cs="Times New Roman"/>
-          <w:b/>
-          <w:bCs/>
-          <w:sz w:val="24"/>
-          <w:szCs w:val="24"/>
-        </w:rPr>
-        <w:t>️</w:t>
-      </w:r>
-      <w:r>
-        <w:rPr>
-          <w:rFonts w:ascii="Times New Roman" w:hAnsi="Times New Roman" w:cs="Times New Roman"/>
-          <w:b/>
-          <w:bCs/>
-          <w:sz w:val="24"/>
-          <w:szCs w:val="24"/>
-        </w:rPr>
-        <w:t>.</w:t>
-      </w:r>
-      <w:r>
-        <w:rPr>
-          <w:rFonts w:ascii="Times New Roman" w:hAnsi="Times New Roman" w:cs="Times New Roman"/>
-          <w:b/>
-          <w:bCs/>
-          <w:sz w:val="24"/>
-          <w:szCs w:val="24"/>
-        </w:rPr>
-        <w:t xml:space="preserve"> Adoption</w:t>
-      </w:r>
-      <w:r>
-        <w:rPr>
-          <w:rFonts w:ascii="Times New Roman" w:hAnsi="Times New Roman" w:cs="Times New Roman"/>
-          <w:b/>
-          <w:bCs/>
-          <w:sz w:val="24"/>
-          <w:szCs w:val="24"/>
-        </w:rPr>
-        <w:t xml:space="preserve"> of Automation Tools </w:t>
+        <w:t xml:space="preserve">4️. Adoption of Automation Tools </w:t>
       </w:r>
       <w:r>
         <w:rPr>
@@ -8257,29 +9235,7 @@
                 <w:sz w:val="24"/>
                 <w:szCs w:val="24"/>
               </w:rPr>
-              <w:t>Infrastructure as Code (</w:t>
-            </w:r>
-            <w:proofErr w:type="spellStart"/>
-            <w:r>
-              <w:rPr>
-                <w:rFonts w:ascii="Times New Roman" w:hAnsi="Times New Roman" w:cs="Times New Roman"/>
-                <w:b/>
-                <w:bCs/>
-                <w:sz w:val="24"/>
-                <w:szCs w:val="24"/>
-              </w:rPr>
-              <w:t>IaC</w:t>
-            </w:r>
-            <w:proofErr w:type="spellEnd"/>
-            <w:r>
-              <w:rPr>
-                <w:rFonts w:ascii="Times New Roman" w:hAnsi="Times New Roman" w:cs="Times New Roman"/>
-                <w:b/>
-                <w:bCs/>
-                <w:sz w:val="24"/>
-                <w:szCs w:val="24"/>
-              </w:rPr>
-              <w:t>)</w:t>
+              <w:t>Infrastructure as Code (IaC)</w:t>
             </w:r>
           </w:p>
         </w:tc>
@@ -8731,23 +9687,13 @@
                 <w:szCs w:val="24"/>
               </w:rPr>
             </w:pPr>
-            <w:proofErr w:type="spellStart"/>
             <w:r>
               <w:rPr>
                 <w:rFonts w:ascii="Times New Roman" w:hAnsi="Times New Roman" w:cs="Times New Roman"/>
                 <w:sz w:val="24"/>
                 <w:szCs w:val="24"/>
               </w:rPr>
-              <w:t>IaC</w:t>
-            </w:r>
-            <w:proofErr w:type="spellEnd"/>
-            <w:r>
-              <w:rPr>
-                <w:rFonts w:ascii="Times New Roman" w:hAnsi="Times New Roman" w:cs="Times New Roman"/>
-                <w:sz w:val="24"/>
-                <w:szCs w:val="24"/>
-              </w:rPr>
-              <w:t>, containerization (Docker, Kubernetes)</w:t>
+              <w:t>IaC, containerization (Docker, Kubernetes)</w:t>
             </w:r>
           </w:p>
         </w:tc>
@@ -8935,6 +9881,155 @@
 <file path=word/numbering.xml><?xml version="1.0" encoding="utf-8"?>
 <w:numbering xmlns:wpc="http://schemas.microsoft.com/office/word/2010/wordprocessingCanvas" xmlns:cx="http://schemas.microsoft.com/office/drawing/2014/chartex" xmlns:cx1="http://schemas.microsoft.com/office/drawing/2015/9/8/chartex" xmlns:cx2="http://schemas.microsoft.com/office/drawing/2015/10/21/chartex" xmlns:cx3="http://schemas.microsoft.com/office/drawing/2016/5/9/chartex" xmlns:cx4="http://schemas.microsoft.com/office/drawing/2016/5/10/chartex" xmlns:cx5="http://schemas.microsoft.com/office/drawing/2016/5/11/chartex" xmlns:cx6="http://schemas.microsoft.com/office/drawing/2016/5/12/chartex" xmlns:cx7="http://schemas.microsoft.com/office/drawing/2016/5/13/chartex" xmlns:cx8="http://schemas.microsoft.com/office/drawing/2016/5/14/chartex" xmlns:mc="http://schemas.openxmlformats.org/markup-compatibility/2006" xmlns:aink="http://schemas.microsoft.com/office/drawing/2016/ink" xmlns:am3d="http://schemas.microsoft.com/office/drawing/2017/model3d" xmlns:o="urn:schemas-microsoft-com:office:office" xmlns:oel="http://schemas.microsoft.com/office/2019/extlst" xmlns:r="http://schemas.openxmlformats.org/officeDocument/2006/relationships" xmlns:m="http://schemas.openxmlformats.org/officeDocument/2006/math" xmlns:v="urn:schemas-microsoft-com:vml" xmlns:wp14="http://schemas.microsoft.com/office/word/2010/wordprocessingDrawing" xmlns:wp="http://schemas.openxmlformats.org/drawingml/2006/wordprocessingDrawing" xmlns:w10="urn:schemas-microsoft-com:office:word" xmlns:w="http://schemas.openxmlformats.org/wordprocessingml/2006/main" xmlns:w14="http://schemas.microsoft.com/office/word/2010/wordml" xmlns:w15="http://schemas.microsoft.com/office/word/2012/wordml" xmlns:w16cex="http://schemas.microsoft.com/office/word/2018/wordml/cex" xmlns:w16cid="http://schemas.microsoft.com/office/word/2016/wordml/cid" xmlns:w16="http://schemas.microsoft.com/office/word/2018/wordml" xmlns:w16du="http://schemas.microsoft.com/office/word/2023/wordml/word16du" xmlns:w16sdtdh="http://schemas.microsoft.com/office/word/2020/wordml/sdtdatahash" xmlns:w16sdtfl="http://schemas.microsoft.com/office/word/2024/wordml/sdtformatlock" xmlns:w16se="http://schemas.microsoft.com/office/word/2015/wordml/symex" xmlns:wpg="http://schemas.microsoft.com/office/word/2010/wordprocessingGroup" xmlns:wpi="http://schemas.microsoft.com/office/word/2010/wordprocessingInk" xmlns:wne="http://schemas.microsoft.com/office/word/2006/wordml" xmlns:wps="http://schemas.microsoft.com/office/word/2010/wordprocessingShape" mc:Ignorable="w14 w15 w16se w16cid w16 w16cex w16sdtdh w16sdtfl w16du wp14">
   <w:abstractNum w:abstractNumId="0" w15:restartNumberingAfterBreak="0">
+    <w:nsid w:val="029B2EB7"/>
+    <w:multiLevelType w:val="multilevel"/>
+    <w:tmpl w:val="BBE03A12"/>
+    <w:lvl w:ilvl="0">
+      <w:start w:val="1"/>
+      <w:numFmt w:val="bullet"/>
+      <w:lvlText w:val=""/>
+      <w:lvlJc w:val="left"/>
+      <w:pPr>
+        <w:tabs>
+          <w:tab w:val="num" w:pos="720"/>
+        </w:tabs>
+        <w:ind w:left="720" w:hanging="360"/>
+      </w:pPr>
+      <w:rPr>
+        <w:rFonts w:ascii="Symbol" w:hAnsi="Symbol" w:hint="default"/>
+        <w:sz w:val="20"/>
+      </w:rPr>
+    </w:lvl>
+    <w:lvl w:ilvl="1" w:tentative="1">
+      <w:start w:val="1"/>
+      <w:numFmt w:val="bullet"/>
+      <w:lvlText w:val="o"/>
+      <w:lvlJc w:val="left"/>
+      <w:pPr>
+        <w:tabs>
+          <w:tab w:val="num" w:pos="1440"/>
+        </w:tabs>
+        <w:ind w:left="1440" w:hanging="360"/>
+      </w:pPr>
+      <w:rPr>
+        <w:rFonts w:ascii="Courier New" w:hAnsi="Courier New" w:hint="default"/>
+        <w:sz w:val="20"/>
+      </w:rPr>
+    </w:lvl>
+    <w:lvl w:ilvl="2" w:tentative="1">
+      <w:start w:val="1"/>
+      <w:numFmt w:val="bullet"/>
+      <w:lvlText w:val=""/>
+      <w:lvlJc w:val="left"/>
+      <w:pPr>
+        <w:tabs>
+          <w:tab w:val="num" w:pos="2160"/>
+        </w:tabs>
+        <w:ind w:left="2160" w:hanging="360"/>
+      </w:pPr>
+      <w:rPr>
+        <w:rFonts w:ascii="Wingdings" w:hAnsi="Wingdings" w:hint="default"/>
+        <w:sz w:val="20"/>
+      </w:rPr>
+    </w:lvl>
+    <w:lvl w:ilvl="3" w:tentative="1">
+      <w:start w:val="1"/>
+      <w:numFmt w:val="bullet"/>
+      <w:lvlText w:val=""/>
+      <w:lvlJc w:val="left"/>
+      <w:pPr>
+        <w:tabs>
+          <w:tab w:val="num" w:pos="2880"/>
+        </w:tabs>
+        <w:ind w:left="2880" w:hanging="360"/>
+      </w:pPr>
+      <w:rPr>
+        <w:rFonts w:ascii="Wingdings" w:hAnsi="Wingdings" w:hint="default"/>
+        <w:sz w:val="20"/>
+      </w:rPr>
+    </w:lvl>
+    <w:lvl w:ilvl="4" w:tentative="1">
+      <w:start w:val="1"/>
+      <w:numFmt w:val="bullet"/>
+      <w:lvlText w:val=""/>
+      <w:lvlJc w:val="left"/>
+      <w:pPr>
+        <w:tabs>
+          <w:tab w:val="num" w:pos="3600"/>
+        </w:tabs>
+        <w:ind w:left="3600" w:hanging="360"/>
+      </w:pPr>
+      <w:rPr>
+        <w:rFonts w:ascii="Wingdings" w:hAnsi="Wingdings" w:hint="default"/>
+        <w:sz w:val="20"/>
+      </w:rPr>
+    </w:lvl>
+    <w:lvl w:ilvl="5" w:tentative="1">
+      <w:start w:val="1"/>
+      <w:numFmt w:val="bullet"/>
+      <w:lvlText w:val=""/>
+      <w:lvlJc w:val="left"/>
+      <w:pPr>
+        <w:tabs>
+          <w:tab w:val="num" w:pos="4320"/>
+        </w:tabs>
+        <w:ind w:left="4320" w:hanging="360"/>
+      </w:pPr>
+      <w:rPr>
+        <w:rFonts w:ascii="Wingdings" w:hAnsi="Wingdings" w:hint="default"/>
+        <w:sz w:val="20"/>
+      </w:rPr>
+    </w:lvl>
+    <w:lvl w:ilvl="6" w:tentative="1">
+      <w:start w:val="1"/>
+      <w:numFmt w:val="bullet"/>
+      <w:lvlText w:val=""/>
+      <w:lvlJc w:val="left"/>
+      <w:pPr>
+        <w:tabs>
+          <w:tab w:val="num" w:pos="5040"/>
+        </w:tabs>
+        <w:ind w:left="5040" w:hanging="360"/>
+      </w:pPr>
+      <w:rPr>
+        <w:rFonts w:ascii="Wingdings" w:hAnsi="Wingdings" w:hint="default"/>
+        <w:sz w:val="20"/>
+      </w:rPr>
+    </w:lvl>
+    <w:lvl w:ilvl="7" w:tentative="1">
+      <w:start w:val="1"/>
+      <w:numFmt w:val="bullet"/>
+      <w:lvlText w:val=""/>
+      <w:lvlJc w:val="left"/>
+      <w:pPr>
+        <w:tabs>
+          <w:tab w:val="num" w:pos="5760"/>
+        </w:tabs>
+        <w:ind w:left="5760" w:hanging="360"/>
+      </w:pPr>
+      <w:rPr>
+        <w:rFonts w:ascii="Wingdings" w:hAnsi="Wingdings" w:hint="default"/>
+        <w:sz w:val="20"/>
+      </w:rPr>
+    </w:lvl>
+    <w:lvl w:ilvl="8" w:tentative="1">
+      <w:start w:val="1"/>
+      <w:numFmt w:val="bullet"/>
+      <w:lvlText w:val=""/>
+      <w:lvlJc w:val="left"/>
+      <w:pPr>
+        <w:tabs>
+          <w:tab w:val="num" w:pos="6480"/>
+        </w:tabs>
+        <w:ind w:left="6480" w:hanging="360"/>
+      </w:pPr>
+      <w:rPr>
+        <w:rFonts w:ascii="Wingdings" w:hAnsi="Wingdings" w:hint="default"/>
+        <w:sz w:val="20"/>
+      </w:rPr>
+    </w:lvl>
+  </w:abstractNum>
+  <w:abstractNum w:abstractNumId="1" w15:restartNumberingAfterBreak="0">
     <w:nsid w:val="075D383F"/>
     <w:multiLevelType w:val="multilevel"/>
     <w:tmpl w:val="01FEDDE2"/>
@@ -9047,7 +10142,7 @@
       </w:pPr>
     </w:lvl>
   </w:abstractNum>
-  <w:abstractNum w:abstractNumId="1" w15:restartNumberingAfterBreak="0">
+  <w:abstractNum w:abstractNumId="2" w15:restartNumberingAfterBreak="0">
     <w:nsid w:val="089728AC"/>
     <w:multiLevelType w:val="hybridMultilevel"/>
     <w:tmpl w:val="13EED618"/>
@@ -9160,7 +10255,7 @@
       </w:rPr>
     </w:lvl>
   </w:abstractNum>
-  <w:abstractNum w:abstractNumId="2" w15:restartNumberingAfterBreak="0">
+  <w:abstractNum w:abstractNumId="3" w15:restartNumberingAfterBreak="0">
     <w:nsid w:val="0AD70363"/>
     <w:multiLevelType w:val="multilevel"/>
     <w:tmpl w:val="327871BA"/>
@@ -9309,7 +10404,156 @@
       </w:rPr>
     </w:lvl>
   </w:abstractNum>
-  <w:abstractNum w:abstractNumId="3" w15:restartNumberingAfterBreak="0">
+  <w:abstractNum w:abstractNumId="4" w15:restartNumberingAfterBreak="0">
+    <w:nsid w:val="10A961A5"/>
+    <w:multiLevelType w:val="multilevel"/>
+    <w:tmpl w:val="A1A4B73E"/>
+    <w:lvl w:ilvl="0">
+      <w:start w:val="1"/>
+      <w:numFmt w:val="bullet"/>
+      <w:lvlText w:val=""/>
+      <w:lvlJc w:val="left"/>
+      <w:pPr>
+        <w:tabs>
+          <w:tab w:val="num" w:pos="720"/>
+        </w:tabs>
+        <w:ind w:left="720" w:hanging="360"/>
+      </w:pPr>
+      <w:rPr>
+        <w:rFonts w:ascii="Symbol" w:hAnsi="Symbol" w:hint="default"/>
+        <w:sz w:val="20"/>
+      </w:rPr>
+    </w:lvl>
+    <w:lvl w:ilvl="1" w:tentative="1">
+      <w:start w:val="1"/>
+      <w:numFmt w:val="bullet"/>
+      <w:lvlText w:val="o"/>
+      <w:lvlJc w:val="left"/>
+      <w:pPr>
+        <w:tabs>
+          <w:tab w:val="num" w:pos="1440"/>
+        </w:tabs>
+        <w:ind w:left="1440" w:hanging="360"/>
+      </w:pPr>
+      <w:rPr>
+        <w:rFonts w:ascii="Courier New" w:hAnsi="Courier New" w:hint="default"/>
+        <w:sz w:val="20"/>
+      </w:rPr>
+    </w:lvl>
+    <w:lvl w:ilvl="2" w:tentative="1">
+      <w:start w:val="1"/>
+      <w:numFmt w:val="bullet"/>
+      <w:lvlText w:val=""/>
+      <w:lvlJc w:val="left"/>
+      <w:pPr>
+        <w:tabs>
+          <w:tab w:val="num" w:pos="2160"/>
+        </w:tabs>
+        <w:ind w:left="2160" w:hanging="360"/>
+      </w:pPr>
+      <w:rPr>
+        <w:rFonts w:ascii="Wingdings" w:hAnsi="Wingdings" w:hint="default"/>
+        <w:sz w:val="20"/>
+      </w:rPr>
+    </w:lvl>
+    <w:lvl w:ilvl="3" w:tentative="1">
+      <w:start w:val="1"/>
+      <w:numFmt w:val="bullet"/>
+      <w:lvlText w:val=""/>
+      <w:lvlJc w:val="left"/>
+      <w:pPr>
+        <w:tabs>
+          <w:tab w:val="num" w:pos="2880"/>
+        </w:tabs>
+        <w:ind w:left="2880" w:hanging="360"/>
+      </w:pPr>
+      <w:rPr>
+        <w:rFonts w:ascii="Wingdings" w:hAnsi="Wingdings" w:hint="default"/>
+        <w:sz w:val="20"/>
+      </w:rPr>
+    </w:lvl>
+    <w:lvl w:ilvl="4" w:tentative="1">
+      <w:start w:val="1"/>
+      <w:numFmt w:val="bullet"/>
+      <w:lvlText w:val=""/>
+      <w:lvlJc w:val="left"/>
+      <w:pPr>
+        <w:tabs>
+          <w:tab w:val="num" w:pos="3600"/>
+        </w:tabs>
+        <w:ind w:left="3600" w:hanging="360"/>
+      </w:pPr>
+      <w:rPr>
+        <w:rFonts w:ascii="Wingdings" w:hAnsi="Wingdings" w:hint="default"/>
+        <w:sz w:val="20"/>
+      </w:rPr>
+    </w:lvl>
+    <w:lvl w:ilvl="5" w:tentative="1">
+      <w:start w:val="1"/>
+      <w:numFmt w:val="bullet"/>
+      <w:lvlText w:val=""/>
+      <w:lvlJc w:val="left"/>
+      <w:pPr>
+        <w:tabs>
+          <w:tab w:val="num" w:pos="4320"/>
+        </w:tabs>
+        <w:ind w:left="4320" w:hanging="360"/>
+      </w:pPr>
+      <w:rPr>
+        <w:rFonts w:ascii="Wingdings" w:hAnsi="Wingdings" w:hint="default"/>
+        <w:sz w:val="20"/>
+      </w:rPr>
+    </w:lvl>
+    <w:lvl w:ilvl="6" w:tentative="1">
+      <w:start w:val="1"/>
+      <w:numFmt w:val="bullet"/>
+      <w:lvlText w:val=""/>
+      <w:lvlJc w:val="left"/>
+      <w:pPr>
+        <w:tabs>
+          <w:tab w:val="num" w:pos="5040"/>
+        </w:tabs>
+        <w:ind w:left="5040" w:hanging="360"/>
+      </w:pPr>
+      <w:rPr>
+        <w:rFonts w:ascii="Wingdings" w:hAnsi="Wingdings" w:hint="default"/>
+        <w:sz w:val="20"/>
+      </w:rPr>
+    </w:lvl>
+    <w:lvl w:ilvl="7" w:tentative="1">
+      <w:start w:val="1"/>
+      <w:numFmt w:val="bullet"/>
+      <w:lvlText w:val=""/>
+      <w:lvlJc w:val="left"/>
+      <w:pPr>
+        <w:tabs>
+          <w:tab w:val="num" w:pos="5760"/>
+        </w:tabs>
+        <w:ind w:left="5760" w:hanging="360"/>
+      </w:pPr>
+      <w:rPr>
+        <w:rFonts w:ascii="Wingdings" w:hAnsi="Wingdings" w:hint="default"/>
+        <w:sz w:val="20"/>
+      </w:rPr>
+    </w:lvl>
+    <w:lvl w:ilvl="8" w:tentative="1">
+      <w:start w:val="1"/>
+      <w:numFmt w:val="bullet"/>
+      <w:lvlText w:val=""/>
+      <w:lvlJc w:val="left"/>
+      <w:pPr>
+        <w:tabs>
+          <w:tab w:val="num" w:pos="6480"/>
+        </w:tabs>
+        <w:ind w:left="6480" w:hanging="360"/>
+      </w:pPr>
+      <w:rPr>
+        <w:rFonts w:ascii="Wingdings" w:hAnsi="Wingdings" w:hint="default"/>
+        <w:sz w:val="20"/>
+      </w:rPr>
+    </w:lvl>
+  </w:abstractNum>
+  <w:abstractNum w:abstractNumId="5" w15:restartNumberingAfterBreak="0">
     <w:nsid w:val="144959E2"/>
     <w:multiLevelType w:val="multilevel"/>
     <w:tmpl w:val="DC844D12"/>
@@ -9458,7 +10702,7 @@
       </w:rPr>
     </w:lvl>
   </w:abstractNum>
-  <w:abstractNum w:abstractNumId="4" w15:restartNumberingAfterBreak="0">
+  <w:abstractNum w:abstractNumId="6" w15:restartNumberingAfterBreak="0">
     <w:nsid w:val="179E2C51"/>
     <w:multiLevelType w:val="multilevel"/>
     <w:tmpl w:val="99A863BE"/>
@@ -9607,7 +10851,156 @@
       </w:rPr>
     </w:lvl>
   </w:abstractNum>
-  <w:abstractNum w:abstractNumId="5" w15:restartNumberingAfterBreak="0">
+  <w:abstractNum w:abstractNumId="7" w15:restartNumberingAfterBreak="0">
+    <w:nsid w:val="1C4077DF"/>
+    <w:multiLevelType w:val="multilevel"/>
+    <w:tmpl w:val="CDDCF718"/>
+    <w:lvl w:ilvl="0">
+      <w:start w:val="1"/>
+      <w:numFmt w:val="bullet"/>
+      <w:lvlText w:val=""/>
+      <w:lvlJc w:val="left"/>
+      <w:pPr>
+        <w:tabs>
+          <w:tab w:val="num" w:pos="720"/>
+        </w:tabs>
+        <w:ind w:left="720" w:hanging="360"/>
+      </w:pPr>
+      <w:rPr>
+        <w:rFonts w:ascii="Symbol" w:hAnsi="Symbol" w:hint="default"/>
+        <w:sz w:val="20"/>
+      </w:rPr>
+    </w:lvl>
+    <w:lvl w:ilvl="1" w:tentative="1">
+      <w:start w:val="1"/>
+      <w:numFmt w:val="bullet"/>
+      <w:lvlText w:val="o"/>
+      <w:lvlJc w:val="left"/>
+      <w:pPr>
+        <w:tabs>
+          <w:tab w:val="num" w:pos="1440"/>
+        </w:tabs>
+        <w:ind w:left="1440" w:hanging="360"/>
+      </w:pPr>
+      <w:rPr>
+        <w:rFonts w:ascii="Courier New" w:hAnsi="Courier New" w:hint="default"/>
+        <w:sz w:val="20"/>
+      </w:rPr>
+    </w:lvl>
+    <w:lvl w:ilvl="2" w:tentative="1">
+      <w:start w:val="1"/>
+      <w:numFmt w:val="bullet"/>
+      <w:lvlText w:val=""/>
+      <w:lvlJc w:val="left"/>
+      <w:pPr>
+        <w:tabs>
+          <w:tab w:val="num" w:pos="2160"/>
+        </w:tabs>
+        <w:ind w:left="2160" w:hanging="360"/>
+      </w:pPr>
+      <w:rPr>
+        <w:rFonts w:ascii="Wingdings" w:hAnsi="Wingdings" w:hint="default"/>
+        <w:sz w:val="20"/>
+      </w:rPr>
+    </w:lvl>
+    <w:lvl w:ilvl="3" w:tentative="1">
+      <w:start w:val="1"/>
+      <w:numFmt w:val="bullet"/>
+      <w:lvlText w:val=""/>
+      <w:lvlJc w:val="left"/>
+      <w:pPr>
+        <w:tabs>
+          <w:tab w:val="num" w:pos="2880"/>
+        </w:tabs>
+        <w:ind w:left="2880" w:hanging="360"/>
+      </w:pPr>
+      <w:rPr>
+        <w:rFonts w:ascii="Wingdings" w:hAnsi="Wingdings" w:hint="default"/>
+        <w:sz w:val="20"/>
+      </w:rPr>
+    </w:lvl>
+    <w:lvl w:ilvl="4" w:tentative="1">
+      <w:start w:val="1"/>
+      <w:numFmt w:val="bullet"/>
+      <w:lvlText w:val=""/>
+      <w:lvlJc w:val="left"/>
+      <w:pPr>
+        <w:tabs>
+          <w:tab w:val="num" w:pos="3600"/>
+        </w:tabs>
+        <w:ind w:left="3600" w:hanging="360"/>
+      </w:pPr>
+      <w:rPr>
+        <w:rFonts w:ascii="Wingdings" w:hAnsi="Wingdings" w:hint="default"/>
+        <w:sz w:val="20"/>
+      </w:rPr>
+    </w:lvl>
+    <w:lvl w:ilvl="5" w:tentative="1">
+      <w:start w:val="1"/>
+      <w:numFmt w:val="bullet"/>
+      <w:lvlText w:val=""/>
+      <w:lvlJc w:val="left"/>
+      <w:pPr>
+        <w:tabs>
+          <w:tab w:val="num" w:pos="4320"/>
+        </w:tabs>
+        <w:ind w:left="4320" w:hanging="360"/>
+      </w:pPr>
+      <w:rPr>
+        <w:rFonts w:ascii="Wingdings" w:hAnsi="Wingdings" w:hint="default"/>
+        <w:sz w:val="20"/>
+      </w:rPr>
+    </w:lvl>
+    <w:lvl w:ilvl="6" w:tentative="1">
+      <w:start w:val="1"/>
+      <w:numFmt w:val="bullet"/>
+      <w:lvlText w:val=""/>
+      <w:lvlJc w:val="left"/>
+      <w:pPr>
+        <w:tabs>
+          <w:tab w:val="num" w:pos="5040"/>
+        </w:tabs>
+        <w:ind w:left="5040" w:hanging="360"/>
+      </w:pPr>
+      <w:rPr>
+        <w:rFonts w:ascii="Wingdings" w:hAnsi="Wingdings" w:hint="default"/>
+        <w:sz w:val="20"/>
+      </w:rPr>
+    </w:lvl>
+    <w:lvl w:ilvl="7" w:tentative="1">
+      <w:start w:val="1"/>
+      <w:numFmt w:val="bullet"/>
+      <w:lvlText w:val=""/>
+      <w:lvlJc w:val="left"/>
+      <w:pPr>
+        <w:tabs>
+          <w:tab w:val="num" w:pos="5760"/>
+        </w:tabs>
+        <w:ind w:left="5760" w:hanging="360"/>
+      </w:pPr>
+      <w:rPr>
+        <w:rFonts w:ascii="Wingdings" w:hAnsi="Wingdings" w:hint="default"/>
+        <w:sz w:val="20"/>
+      </w:rPr>
+    </w:lvl>
+    <w:lvl w:ilvl="8" w:tentative="1">
+      <w:start w:val="1"/>
+      <w:numFmt w:val="bullet"/>
+      <w:lvlText w:val=""/>
+      <w:lvlJc w:val="left"/>
+      <w:pPr>
+        <w:tabs>
+          <w:tab w:val="num" w:pos="6480"/>
+        </w:tabs>
+        <w:ind w:left="6480" w:hanging="360"/>
+      </w:pPr>
+      <w:rPr>
+        <w:rFonts w:ascii="Wingdings" w:hAnsi="Wingdings" w:hint="default"/>
+        <w:sz w:val="20"/>
+      </w:rPr>
+    </w:lvl>
+  </w:abstractNum>
+  <w:abstractNum w:abstractNumId="8" w15:restartNumberingAfterBreak="0">
     <w:nsid w:val="1D2305A5"/>
     <w:multiLevelType w:val="hybridMultilevel"/>
     <w:tmpl w:val="696CD068"/>
@@ -9720,7 +11113,7 @@
       </w:rPr>
     </w:lvl>
   </w:abstractNum>
-  <w:abstractNum w:abstractNumId="6" w15:restartNumberingAfterBreak="0">
+  <w:abstractNum w:abstractNumId="9" w15:restartNumberingAfterBreak="0">
     <w:nsid w:val="21BD766B"/>
     <w:multiLevelType w:val="multilevel"/>
     <w:tmpl w:val="941C73F6"/>
@@ -9869,7 +11262,7 @@
       </w:rPr>
     </w:lvl>
   </w:abstractNum>
-  <w:abstractNum w:abstractNumId="7" w15:restartNumberingAfterBreak="0">
+  <w:abstractNum w:abstractNumId="10" w15:restartNumberingAfterBreak="0">
     <w:nsid w:val="22194FAA"/>
     <w:multiLevelType w:val="multilevel"/>
     <w:tmpl w:val="CAC47174"/>
@@ -10018,7 +11411,7 @@
       </w:rPr>
     </w:lvl>
   </w:abstractNum>
-  <w:abstractNum w:abstractNumId="8" w15:restartNumberingAfterBreak="0">
+  <w:abstractNum w:abstractNumId="11" w15:restartNumberingAfterBreak="0">
     <w:nsid w:val="2F81357E"/>
     <w:multiLevelType w:val="multilevel"/>
     <w:tmpl w:val="C332E6A0"/>
@@ -10131,7 +11524,7 @@
       </w:pPr>
     </w:lvl>
   </w:abstractNum>
-  <w:abstractNum w:abstractNumId="9" w15:restartNumberingAfterBreak="0">
+  <w:abstractNum w:abstractNumId="12" w15:restartNumberingAfterBreak="0">
     <w:nsid w:val="30211C79"/>
     <w:multiLevelType w:val="multilevel"/>
     <w:tmpl w:val="2C26F726"/>
@@ -10280,7 +11673,7 @@
       </w:rPr>
     </w:lvl>
   </w:abstractNum>
-  <w:abstractNum w:abstractNumId="10" w15:restartNumberingAfterBreak="0">
+  <w:abstractNum w:abstractNumId="13" w15:restartNumberingAfterBreak="0">
     <w:nsid w:val="362E35A0"/>
     <w:multiLevelType w:val="multilevel"/>
     <w:tmpl w:val="F38853F8"/>
@@ -10429,7 +11822,7 @@
       </w:rPr>
     </w:lvl>
   </w:abstractNum>
-  <w:abstractNum w:abstractNumId="11" w15:restartNumberingAfterBreak="0">
+  <w:abstractNum w:abstractNumId="14" w15:restartNumberingAfterBreak="0">
     <w:nsid w:val="370A3F42"/>
     <w:multiLevelType w:val="multilevel"/>
     <w:tmpl w:val="10F85F54"/>
@@ -10578,7 +11971,7 @@
       </w:rPr>
     </w:lvl>
   </w:abstractNum>
-  <w:abstractNum w:abstractNumId="12" w15:restartNumberingAfterBreak="0">
+  <w:abstractNum w:abstractNumId="15" w15:restartNumberingAfterBreak="0">
     <w:nsid w:val="3ABC0CB1"/>
     <w:multiLevelType w:val="multilevel"/>
     <w:tmpl w:val="369C515C"/>
@@ -10727,7 +12120,7 @@
       </w:rPr>
     </w:lvl>
   </w:abstractNum>
-  <w:abstractNum w:abstractNumId="13" w15:restartNumberingAfterBreak="0">
+  <w:abstractNum w:abstractNumId="16" w15:restartNumberingAfterBreak="0">
     <w:nsid w:val="4A817A1A"/>
     <w:multiLevelType w:val="multilevel"/>
     <w:tmpl w:val="2C866566"/>
@@ -10876,7 +12269,7 @@
       </w:rPr>
     </w:lvl>
   </w:abstractNum>
-  <w:abstractNum w:abstractNumId="14" w15:restartNumberingAfterBreak="0">
+  <w:abstractNum w:abstractNumId="17" w15:restartNumberingAfterBreak="0">
     <w:nsid w:val="4A96306F"/>
     <w:multiLevelType w:val="multilevel"/>
     <w:tmpl w:val="99DABD10"/>
@@ -11025,7 +12418,7 @@
       </w:rPr>
     </w:lvl>
   </w:abstractNum>
-  <w:abstractNum w:abstractNumId="15" w15:restartNumberingAfterBreak="0">
+  <w:abstractNum w:abstractNumId="18" w15:restartNumberingAfterBreak="0">
     <w:nsid w:val="4BE67F66"/>
     <w:multiLevelType w:val="multilevel"/>
     <w:tmpl w:val="7E5AA884"/>
@@ -11174,7 +12567,7 @@
       </w:rPr>
     </w:lvl>
   </w:abstractNum>
-  <w:abstractNum w:abstractNumId="16" w15:restartNumberingAfterBreak="0">
+  <w:abstractNum w:abstractNumId="19" w15:restartNumberingAfterBreak="0">
     <w:nsid w:val="4C0F2599"/>
     <w:multiLevelType w:val="multilevel"/>
     <w:tmpl w:val="53E030C2"/>
@@ -11323,7 +12716,7 @@
       </w:rPr>
     </w:lvl>
   </w:abstractNum>
-  <w:abstractNum w:abstractNumId="17" w15:restartNumberingAfterBreak="0">
+  <w:abstractNum w:abstractNumId="20" w15:restartNumberingAfterBreak="0">
     <w:nsid w:val="4D602314"/>
     <w:multiLevelType w:val="multilevel"/>
     <w:tmpl w:val="BBB0BE82"/>
@@ -11472,7 +12865,7 @@
       </w:rPr>
     </w:lvl>
   </w:abstractNum>
-  <w:abstractNum w:abstractNumId="18" w15:restartNumberingAfterBreak="0">
+  <w:abstractNum w:abstractNumId="21" w15:restartNumberingAfterBreak="0">
     <w:nsid w:val="538E2503"/>
     <w:multiLevelType w:val="multilevel"/>
     <w:tmpl w:val="5BAADAA0"/>
@@ -11621,7 +13014,7 @@
       </w:rPr>
     </w:lvl>
   </w:abstractNum>
-  <w:abstractNum w:abstractNumId="19" w15:restartNumberingAfterBreak="0">
+  <w:abstractNum w:abstractNumId="22" w15:restartNumberingAfterBreak="0">
     <w:nsid w:val="54D707E4"/>
     <w:multiLevelType w:val="multilevel"/>
     <w:tmpl w:val="CCA20C78"/>
@@ -11770,7 +13163,7 @@
       </w:rPr>
     </w:lvl>
   </w:abstractNum>
-  <w:abstractNum w:abstractNumId="20" w15:restartNumberingAfterBreak="0">
+  <w:abstractNum w:abstractNumId="23" w15:restartNumberingAfterBreak="0">
     <w:nsid w:val="55D5055A"/>
     <w:multiLevelType w:val="multilevel"/>
     <w:tmpl w:val="15AA9A20"/>
@@ -11919,7 +13312,7 @@
       </w:rPr>
     </w:lvl>
   </w:abstractNum>
-  <w:abstractNum w:abstractNumId="21" w15:restartNumberingAfterBreak="0">
+  <w:abstractNum w:abstractNumId="24" w15:restartNumberingAfterBreak="0">
     <w:nsid w:val="569312C7"/>
     <w:multiLevelType w:val="multilevel"/>
     <w:tmpl w:val="2E946AA4"/>
@@ -12068,7 +13461,156 @@
       </w:rPr>
     </w:lvl>
   </w:abstractNum>
-  <w:abstractNum w:abstractNumId="22" w15:restartNumberingAfterBreak="0">
+  <w:abstractNum w:abstractNumId="25" w15:restartNumberingAfterBreak="0">
+    <w:nsid w:val="57133493"/>
+    <w:multiLevelType w:val="multilevel"/>
+    <w:tmpl w:val="68786294"/>
+    <w:lvl w:ilvl="0">
+      <w:start w:val="1"/>
+      <w:numFmt w:val="bullet"/>
+      <w:lvlText w:val=""/>
+      <w:lvlJc w:val="left"/>
+      <w:pPr>
+        <w:tabs>
+          <w:tab w:val="num" w:pos="720"/>
+        </w:tabs>
+        <w:ind w:left="720" w:hanging="360"/>
+      </w:pPr>
+      <w:rPr>
+        <w:rFonts w:ascii="Symbol" w:hAnsi="Symbol" w:hint="default"/>
+        <w:sz w:val="20"/>
+      </w:rPr>
+    </w:lvl>
+    <w:lvl w:ilvl="1" w:tentative="1">
+      <w:start w:val="1"/>
+      <w:numFmt w:val="bullet"/>
+      <w:lvlText w:val="o"/>
+      <w:lvlJc w:val="left"/>
+      <w:pPr>
+        <w:tabs>
+          <w:tab w:val="num" w:pos="1440"/>
+        </w:tabs>
+        <w:ind w:left="1440" w:hanging="360"/>
+      </w:pPr>
+      <w:rPr>
+        <w:rFonts w:ascii="Courier New" w:hAnsi="Courier New" w:hint="default"/>
+        <w:sz w:val="20"/>
+      </w:rPr>
+    </w:lvl>
+    <w:lvl w:ilvl="2" w:tentative="1">
+      <w:start w:val="1"/>
+      <w:numFmt w:val="bullet"/>
+      <w:lvlText w:val=""/>
+      <w:lvlJc w:val="left"/>
+      <w:pPr>
+        <w:tabs>
+          <w:tab w:val="num" w:pos="2160"/>
+        </w:tabs>
+        <w:ind w:left="2160" w:hanging="360"/>
+      </w:pPr>
+      <w:rPr>
+        <w:rFonts w:ascii="Wingdings" w:hAnsi="Wingdings" w:hint="default"/>
+        <w:sz w:val="20"/>
+      </w:rPr>
+    </w:lvl>
+    <w:lvl w:ilvl="3" w:tentative="1">
+      <w:start w:val="1"/>
+      <w:numFmt w:val="bullet"/>
+      <w:lvlText w:val=""/>
+      <w:lvlJc w:val="left"/>
+      <w:pPr>
+        <w:tabs>
+          <w:tab w:val="num" w:pos="2880"/>
+        </w:tabs>
+        <w:ind w:left="2880" w:hanging="360"/>
+      </w:pPr>
+      <w:rPr>
+        <w:rFonts w:ascii="Wingdings" w:hAnsi="Wingdings" w:hint="default"/>
+        <w:sz w:val="20"/>
+      </w:rPr>
+    </w:lvl>
+    <w:lvl w:ilvl="4" w:tentative="1">
+      <w:start w:val="1"/>
+      <w:numFmt w:val="bullet"/>
+      <w:lvlText w:val=""/>
+      <w:lvlJc w:val="left"/>
+      <w:pPr>
+        <w:tabs>
+          <w:tab w:val="num" w:pos="3600"/>
+        </w:tabs>
+        <w:ind w:left="3600" w:hanging="360"/>
+      </w:pPr>
+      <w:rPr>
+        <w:rFonts w:ascii="Wingdings" w:hAnsi="Wingdings" w:hint="default"/>
+        <w:sz w:val="20"/>
+      </w:rPr>
+    </w:lvl>
+    <w:lvl w:ilvl="5" w:tentative="1">
+      <w:start w:val="1"/>
+      <w:numFmt w:val="bullet"/>
+      <w:lvlText w:val=""/>
+      <w:lvlJc w:val="left"/>
+      <w:pPr>
+        <w:tabs>
+          <w:tab w:val="num" w:pos="4320"/>
+        </w:tabs>
+        <w:ind w:left="4320" w:hanging="360"/>
+      </w:pPr>
+      <w:rPr>
+        <w:rFonts w:ascii="Wingdings" w:hAnsi="Wingdings" w:hint="default"/>
+        <w:sz w:val="20"/>
+      </w:rPr>
+    </w:lvl>
+    <w:lvl w:ilvl="6" w:tentative="1">
+      <w:start w:val="1"/>
+      <w:numFmt w:val="bullet"/>
+      <w:lvlText w:val=""/>
+      <w:lvlJc w:val="left"/>
+      <w:pPr>
+        <w:tabs>
+          <w:tab w:val="num" w:pos="5040"/>
+        </w:tabs>
+        <w:ind w:left="5040" w:hanging="360"/>
+      </w:pPr>
+      <w:rPr>
+        <w:rFonts w:ascii="Wingdings" w:hAnsi="Wingdings" w:hint="default"/>
+        <w:sz w:val="20"/>
+      </w:rPr>
+    </w:lvl>
+    <w:lvl w:ilvl="7" w:tentative="1">
+      <w:start w:val="1"/>
+      <w:numFmt w:val="bullet"/>
+      <w:lvlText w:val=""/>
+      <w:lvlJc w:val="left"/>
+      <w:pPr>
+        <w:tabs>
+          <w:tab w:val="num" w:pos="5760"/>
+        </w:tabs>
+        <w:ind w:left="5760" w:hanging="360"/>
+      </w:pPr>
+      <w:rPr>
+        <w:rFonts w:ascii="Wingdings" w:hAnsi="Wingdings" w:hint="default"/>
+        <w:sz w:val="20"/>
+      </w:rPr>
+    </w:lvl>
+    <w:lvl w:ilvl="8" w:tentative="1">
+      <w:start w:val="1"/>
+      <w:numFmt w:val="bullet"/>
+      <w:lvlText w:val=""/>
+      <w:lvlJc w:val="left"/>
+      <w:pPr>
+        <w:tabs>
+          <w:tab w:val="num" w:pos="6480"/>
+        </w:tabs>
+        <w:ind w:left="6480" w:hanging="360"/>
+      </w:pPr>
+      <w:rPr>
+        <w:rFonts w:ascii="Wingdings" w:hAnsi="Wingdings" w:hint="default"/>
+        <w:sz w:val="20"/>
+      </w:rPr>
+    </w:lvl>
+  </w:abstractNum>
+  <w:abstractNum w:abstractNumId="26" w15:restartNumberingAfterBreak="0">
     <w:nsid w:val="57B33ECB"/>
     <w:multiLevelType w:val="hybridMultilevel"/>
     <w:tmpl w:val="415E13F2"/>
@@ -12181,7 +13723,7 @@
       </w:rPr>
     </w:lvl>
   </w:abstractNum>
-  <w:abstractNum w:abstractNumId="23" w15:restartNumberingAfterBreak="0">
+  <w:abstractNum w:abstractNumId="27" w15:restartNumberingAfterBreak="0">
     <w:nsid w:val="5C376860"/>
     <w:multiLevelType w:val="multilevel"/>
     <w:tmpl w:val="EF8092EE"/>
@@ -12330,7 +13872,7 @@
       </w:rPr>
     </w:lvl>
   </w:abstractNum>
-  <w:abstractNum w:abstractNumId="24" w15:restartNumberingAfterBreak="0">
+  <w:abstractNum w:abstractNumId="28" w15:restartNumberingAfterBreak="0">
     <w:nsid w:val="5E010D8A"/>
     <w:multiLevelType w:val="multilevel"/>
     <w:tmpl w:val="52340642"/>
@@ -12479,7 +14021,7 @@
       </w:rPr>
     </w:lvl>
   </w:abstractNum>
-  <w:abstractNum w:abstractNumId="25" w15:restartNumberingAfterBreak="0">
+  <w:abstractNum w:abstractNumId="29" w15:restartNumberingAfterBreak="0">
     <w:nsid w:val="60543CB2"/>
     <w:multiLevelType w:val="multilevel"/>
     <w:tmpl w:val="5194235E"/>
@@ -12628,7 +14170,7 @@
       </w:rPr>
     </w:lvl>
   </w:abstractNum>
-  <w:abstractNum w:abstractNumId="26" w15:restartNumberingAfterBreak="0">
+  <w:abstractNum w:abstractNumId="30" w15:restartNumberingAfterBreak="0">
     <w:nsid w:val="60E4442B"/>
     <w:multiLevelType w:val="multilevel"/>
     <w:tmpl w:val="EB52474E"/>
@@ -12777,7 +14319,7 @@
       </w:rPr>
     </w:lvl>
   </w:abstractNum>
-  <w:abstractNum w:abstractNumId="27" w15:restartNumberingAfterBreak="0">
+  <w:abstractNum w:abstractNumId="31" w15:restartNumberingAfterBreak="0">
     <w:nsid w:val="621D3F0F"/>
     <w:multiLevelType w:val="multilevel"/>
     <w:tmpl w:val="A86EFC0C"/>
@@ -12926,7 +14468,7 @@
       </w:rPr>
     </w:lvl>
   </w:abstractNum>
-  <w:abstractNum w:abstractNumId="28" w15:restartNumberingAfterBreak="0">
+  <w:abstractNum w:abstractNumId="32" w15:restartNumberingAfterBreak="0">
     <w:nsid w:val="657A4752"/>
     <w:multiLevelType w:val="multilevel"/>
     <w:tmpl w:val="C882AD8A"/>
@@ -13075,7 +14617,7 @@
       </w:rPr>
     </w:lvl>
   </w:abstractNum>
-  <w:abstractNum w:abstractNumId="29" w15:restartNumberingAfterBreak="0">
+  <w:abstractNum w:abstractNumId="33" w15:restartNumberingAfterBreak="0">
     <w:nsid w:val="777818B2"/>
     <w:multiLevelType w:val="multilevel"/>
     <w:tmpl w:val="1E4EE2AA"/>
@@ -13224,7 +14766,7 @@
       </w:rPr>
     </w:lvl>
   </w:abstractNum>
-  <w:abstractNum w:abstractNumId="30" w15:restartNumberingAfterBreak="0">
+  <w:abstractNum w:abstractNumId="34" w15:restartNumberingAfterBreak="0">
     <w:nsid w:val="7A456EAF"/>
     <w:multiLevelType w:val="multilevel"/>
     <w:tmpl w:val="E20EECB2"/>
@@ -13373,7 +14915,7 @@
       </w:rPr>
     </w:lvl>
   </w:abstractNum>
-  <w:abstractNum w:abstractNumId="31" w15:restartNumberingAfterBreak="0">
+  <w:abstractNum w:abstractNumId="35" w15:restartNumberingAfterBreak="0">
     <w:nsid w:val="7C7D246A"/>
     <w:multiLevelType w:val="multilevel"/>
     <w:tmpl w:val="505EBD4A"/>
@@ -13522,7 +15064,7 @@
       </w:rPr>
     </w:lvl>
   </w:abstractNum>
-  <w:abstractNum w:abstractNumId="32" w15:restartNumberingAfterBreak="0">
+  <w:abstractNum w:abstractNumId="36" w15:restartNumberingAfterBreak="0">
     <w:nsid w:val="7E31701E"/>
     <w:multiLevelType w:val="multilevel"/>
     <w:tmpl w:val="DBD27FA0"/>
@@ -13672,103 +15214,115 @@
     </w:lvl>
   </w:abstractNum>
   <w:num w:numId="1" w16cid:durableId="28720973">
+    <w:abstractNumId w:val="6"/>
+  </w:num>
+  <w:num w:numId="2" w16cid:durableId="1474634947">
+    <w:abstractNumId w:val="14"/>
+  </w:num>
+  <w:num w:numId="3" w16cid:durableId="263343189">
+    <w:abstractNumId w:val="5"/>
+  </w:num>
+  <w:num w:numId="4" w16cid:durableId="344403716">
+    <w:abstractNumId w:val="11"/>
+  </w:num>
+  <w:num w:numId="5" w16cid:durableId="153421959">
+    <w:abstractNumId w:val="30"/>
+  </w:num>
+  <w:num w:numId="6" w16cid:durableId="196044736">
+    <w:abstractNumId w:val="29"/>
+  </w:num>
+  <w:num w:numId="7" w16cid:durableId="537008734">
+    <w:abstractNumId w:val="35"/>
+  </w:num>
+  <w:num w:numId="8" w16cid:durableId="1891575925">
+    <w:abstractNumId w:val="13"/>
+  </w:num>
+  <w:num w:numId="9" w16cid:durableId="616913323">
+    <w:abstractNumId w:val="27"/>
+  </w:num>
+  <w:num w:numId="10" w16cid:durableId="1277568516">
+    <w:abstractNumId w:val="16"/>
+  </w:num>
+  <w:num w:numId="11" w16cid:durableId="403722837">
+    <w:abstractNumId w:val="34"/>
+  </w:num>
+  <w:num w:numId="12" w16cid:durableId="2088067644">
+    <w:abstractNumId w:val="19"/>
+  </w:num>
+  <w:num w:numId="13" w16cid:durableId="1350789345">
+    <w:abstractNumId w:val="22"/>
+  </w:num>
+  <w:num w:numId="14" w16cid:durableId="1413548912">
+    <w:abstractNumId w:val="21"/>
+  </w:num>
+  <w:num w:numId="15" w16cid:durableId="1420522927">
+    <w:abstractNumId w:val="1"/>
+  </w:num>
+  <w:num w:numId="16" w16cid:durableId="1024867135">
+    <w:abstractNumId w:val="24"/>
+  </w:num>
+  <w:num w:numId="17" w16cid:durableId="1775130810">
+    <w:abstractNumId w:val="10"/>
+  </w:num>
+  <w:num w:numId="18" w16cid:durableId="503054830">
+    <w:abstractNumId w:val="9"/>
+  </w:num>
+  <w:num w:numId="19" w16cid:durableId="1417244540">
+    <w:abstractNumId w:val="15"/>
+  </w:num>
+  <w:num w:numId="20" w16cid:durableId="343290671">
+    <w:abstractNumId w:val="12"/>
+  </w:num>
+  <w:num w:numId="21" w16cid:durableId="1573469609">
+    <w:abstractNumId w:val="36"/>
+  </w:num>
+  <w:num w:numId="22" w16cid:durableId="1483348918">
+    <w:abstractNumId w:val="17"/>
+  </w:num>
+  <w:num w:numId="23" w16cid:durableId="760495511">
+    <w:abstractNumId w:val="18"/>
+  </w:num>
+  <w:num w:numId="24" w16cid:durableId="1502697222">
+    <w:abstractNumId w:val="26"/>
+  </w:num>
+  <w:num w:numId="25" w16cid:durableId="181625285">
+    <w:abstractNumId w:val="8"/>
+  </w:num>
+  <w:num w:numId="26" w16cid:durableId="964585555">
+    <w:abstractNumId w:val="2"/>
+  </w:num>
+  <w:num w:numId="27" w16cid:durableId="897403181">
+    <w:abstractNumId w:val="23"/>
+  </w:num>
+  <w:num w:numId="28" w16cid:durableId="808787835">
+    <w:abstractNumId w:val="3"/>
+  </w:num>
+  <w:num w:numId="29" w16cid:durableId="176113837">
+    <w:abstractNumId w:val="33"/>
+  </w:num>
+  <w:num w:numId="30" w16cid:durableId="1896894464">
+    <w:abstractNumId w:val="31"/>
+  </w:num>
+  <w:num w:numId="31" w16cid:durableId="1208448186">
+    <w:abstractNumId w:val="28"/>
+  </w:num>
+  <w:num w:numId="32" w16cid:durableId="43794157">
+    <w:abstractNumId w:val="32"/>
+  </w:num>
+  <w:num w:numId="33" w16cid:durableId="2054647695">
+    <w:abstractNumId w:val="20"/>
+  </w:num>
+  <w:num w:numId="34" w16cid:durableId="1888830091">
+    <w:abstractNumId w:val="7"/>
+  </w:num>
+  <w:num w:numId="35" w16cid:durableId="556598934">
     <w:abstractNumId w:val="4"/>
   </w:num>
-  <w:num w:numId="2" w16cid:durableId="1474634947">
-    <w:abstractNumId w:val="11"/>
-  </w:num>
-  <w:num w:numId="3" w16cid:durableId="263343189">
-    <w:abstractNumId w:val="3"/>
-  </w:num>
-  <w:num w:numId="4" w16cid:durableId="344403716">
-    <w:abstractNumId w:val="8"/>
-  </w:num>
-  <w:num w:numId="5" w16cid:durableId="153421959">
-    <w:abstractNumId w:val="26"/>
-  </w:num>
-  <w:num w:numId="6" w16cid:durableId="196044736">
+  <w:num w:numId="36" w16cid:durableId="360711874">
     <w:abstractNumId w:val="25"/>
   </w:num>
-  <w:num w:numId="7" w16cid:durableId="537008734">
-    <w:abstractNumId w:val="31"/>
-  </w:num>
-  <w:num w:numId="8" w16cid:durableId="1891575925">
-    <w:abstractNumId w:val="10"/>
-  </w:num>
-  <w:num w:numId="9" w16cid:durableId="616913323">
-    <w:abstractNumId w:val="23"/>
-  </w:num>
-  <w:num w:numId="10" w16cid:durableId="1277568516">
-    <w:abstractNumId w:val="13"/>
-  </w:num>
-  <w:num w:numId="11" w16cid:durableId="403722837">
-    <w:abstractNumId w:val="30"/>
-  </w:num>
-  <w:num w:numId="12" w16cid:durableId="2088067644">
-    <w:abstractNumId w:val="16"/>
-  </w:num>
-  <w:num w:numId="13" w16cid:durableId="1350789345">
-    <w:abstractNumId w:val="19"/>
-  </w:num>
-  <w:num w:numId="14" w16cid:durableId="1413548912">
-    <w:abstractNumId w:val="18"/>
-  </w:num>
-  <w:num w:numId="15" w16cid:durableId="1420522927">
+  <w:num w:numId="37" w16cid:durableId="685668975">
     <w:abstractNumId w:val="0"/>
-  </w:num>
-  <w:num w:numId="16" w16cid:durableId="1024867135">
-    <w:abstractNumId w:val="21"/>
-  </w:num>
-  <w:num w:numId="17" w16cid:durableId="1775130810">
-    <w:abstractNumId w:val="7"/>
-  </w:num>
-  <w:num w:numId="18" w16cid:durableId="503054830">
-    <w:abstractNumId w:val="6"/>
-  </w:num>
-  <w:num w:numId="19" w16cid:durableId="1417244540">
-    <w:abstractNumId w:val="12"/>
-  </w:num>
-  <w:num w:numId="20" w16cid:durableId="343290671">
-    <w:abstractNumId w:val="9"/>
-  </w:num>
-  <w:num w:numId="21" w16cid:durableId="1573469609">
-    <w:abstractNumId w:val="32"/>
-  </w:num>
-  <w:num w:numId="22" w16cid:durableId="1483348918">
-    <w:abstractNumId w:val="14"/>
-  </w:num>
-  <w:num w:numId="23" w16cid:durableId="760495511">
-    <w:abstractNumId w:val="15"/>
-  </w:num>
-  <w:num w:numId="24" w16cid:durableId="1502697222">
-    <w:abstractNumId w:val="22"/>
-  </w:num>
-  <w:num w:numId="25" w16cid:durableId="181625285">
-    <w:abstractNumId w:val="5"/>
-  </w:num>
-  <w:num w:numId="26" w16cid:durableId="964585555">
-    <w:abstractNumId w:val="1"/>
-  </w:num>
-  <w:num w:numId="27" w16cid:durableId="897403181">
-    <w:abstractNumId w:val="20"/>
-  </w:num>
-  <w:num w:numId="28" w16cid:durableId="808787835">
-    <w:abstractNumId w:val="2"/>
-  </w:num>
-  <w:num w:numId="29" w16cid:durableId="176113837">
-    <w:abstractNumId w:val="29"/>
-  </w:num>
-  <w:num w:numId="30" w16cid:durableId="1896894464">
-    <w:abstractNumId w:val="27"/>
-  </w:num>
-  <w:num w:numId="31" w16cid:durableId="1208448186">
-    <w:abstractNumId w:val="24"/>
-  </w:num>
-  <w:num w:numId="32" w16cid:durableId="43794157">
-    <w:abstractNumId w:val="28"/>
-  </w:num>
-  <w:num w:numId="33" w16cid:durableId="2054647695">
-    <w:abstractNumId w:val="17"/>
   </w:num>
 </w:numbering>
 </file>

</xml_diff>